<commit_message>
Deploy: Re-entry grant + resume answers + resume timer + split-screen passage
</commit_message>
<xml_diff>
--- a/public/docs/ClassCurio_Teacher_Guide.docx
+++ b/public/docs/ClassCurio_Teacher_Guide.docx
@@ -1246,7 +1246,7 @@
           <w:bCs/>
           <w:color w:val="1A1E33"/>
         </w:rPr>
-        <w:t xml:space="preserve">7. Creating an assessment — manually</w:t>
+        <w:t xml:space="preserve">7. Preview the assessment (NEW)</w:t>
       </w:r>
     </w:p>
     <w:p>
@@ -1260,20 +1260,7 @@
           <w:rFonts w:ascii="Arial" w:cs="Arial" w:eastAsia="Arial" w:hAnsi="Arial"/>
           <w:rtl w:val="false"/>
         </w:rPr>
-        <w:t xml:space="preserve">Click + New assessment and then Start from scratch. Fill in the builder.</w:t>
-      </w:r>
-    </w:p>
-    <w:p>
-      <w:pPr>
-        <w:pStyle w:val="Heading3"/>
-      </w:pPr>
-      <w:r>
-        <w:rPr>
-          <w:b/>
-          <w:bCs/>
-          <w:color w:val="6D28D9"/>
-        </w:rPr>
-        <w:t xml:space="preserve">Basic settings</w:t>
+        <w:t xml:space="preserve">After you save (or duplicate) an assessment, click 👁 Preview on the assessment card to open a read-only view in a new tab. You see every section, passage, question, listening audio, and match-the-following pair exactly as a student would.</w:t>
       </w:r>
     </w:p>
     <w:p>
@@ -1291,7 +1278,7 @@
         <w:rPr>
           <w:rtl w:val="false"/>
         </w:rPr>
-        <w:t xml:space="preserve">Title — what students see at the top of the assessment.</w:t>
+        <w:t xml:space="preserve">Toggle Show answer key at the top to verify correct answers.</w:t>
       </w:r>
     </w:p>
     <w:p>
@@ -1309,7 +1296,7 @@
         <w:rPr>
           <w:rtl w:val="false"/>
         </w:rPr>
-        <w:t xml:space="preserve">Class — which class can take this assessment.</w:t>
+        <w:t xml:space="preserve">No lockdown runs in preview — you can navigate freely.</w:t>
       </w:r>
     </w:p>
     <w:p>
@@ -1327,214 +1314,7 @@
         <w:rPr>
           <w:rtl w:val="false"/>
         </w:rPr>
-        <w:t xml:space="preserve">Subject — pick from the dropdown. Listening, IELTS, TOEFL, and PISA enable special audio behaviour (see Section 9).</w:t>
-      </w:r>
-    </w:p>
-    <w:p>
-      <w:pPr>
-        <w:pStyle w:val="ListParagraph"/>
-        <w:numPr>
-          <w:ilvl w:val="0"/>
-          <w:numId w:val="3"/>
-        </w:numPr>
-        <w:bidi w:val="false"/>
-        <w:spacing w:after="40" w:before="40"/>
-        <w:jc w:val="left"/>
-      </w:pPr>
-      <w:r>
-        <w:rPr>
-          <w:rtl w:val="false"/>
-        </w:rPr>
-        <w:t xml:space="preserve">Language of assessment — tells the AI which language to grade in and which voices to suggest for listening audio.</w:t>
-      </w:r>
-    </w:p>
-    <w:p>
-      <w:pPr>
-        <w:pStyle w:val="ListParagraph"/>
-        <w:numPr>
-          <w:ilvl w:val="0"/>
-          <w:numId w:val="3"/>
-        </w:numPr>
-        <w:bidi w:val="false"/>
-        <w:spacing w:after="40" w:before="40"/>
-        <w:jc w:val="left"/>
-      </w:pPr>
-      <w:r>
-        <w:rPr>
-          <w:rtl w:val="false"/>
-        </w:rPr>
-        <w:t xml:space="preserve">Grade level, Academic year, Term, Scheduled date.</w:t>
-      </w:r>
-    </w:p>
-    <w:p>
-      <w:pPr>
-        <w:pStyle w:val="ListParagraph"/>
-        <w:numPr>
-          <w:ilvl w:val="0"/>
-          <w:numId w:val="3"/>
-        </w:numPr>
-        <w:bidi w:val="false"/>
-        <w:spacing w:after="40" w:before="40"/>
-        <w:jc w:val="left"/>
-      </w:pPr>
-      <w:r>
-        <w:rPr>
-          <w:rtl w:val="false"/>
-        </w:rPr>
-        <w:t xml:space="preserve">Duration in minutes — the timer the student sees.</w:t>
-      </w:r>
-    </w:p>
-    <w:p>
-      <w:pPr>
-        <w:pStyle w:val="ListParagraph"/>
-        <w:numPr>
-          <w:ilvl w:val="0"/>
-          <w:numId w:val="3"/>
-        </w:numPr>
-        <w:bidi w:val="false"/>
-        <w:spacing w:after="40" w:before="40"/>
-        <w:jc w:val="left"/>
-      </w:pPr>
-      <w:r>
-        <w:rPr>
-          <w:rtl w:val="false"/>
-        </w:rPr>
-        <w:t xml:space="preserve">Delivery mode — Online (webcam mandatory) or On-site (you supervise in person, webcam not required).</w:t>
-      </w:r>
-    </w:p>
-    <w:p>
-      <w:pPr>
-        <w:pStyle w:val="ListParagraph"/>
-        <w:numPr>
-          <w:ilvl w:val="0"/>
-          <w:numId w:val="3"/>
-        </w:numPr>
-        <w:bidi w:val="false"/>
-        <w:spacing w:after="40" w:before="40"/>
-        <w:jc w:val="left"/>
-      </w:pPr>
-      <w:r>
-        <w:rPr>
-          <w:rtl w:val="false"/>
-        </w:rPr>
-        <w:t xml:space="preserve">Published / Draft — only published assessments are visible to students.</w:t>
-      </w:r>
-    </w:p>
-    <w:p>
-      <w:pPr>
-        <w:pStyle w:val="Heading3"/>
-      </w:pPr>
-      <w:r>
-        <w:rPr>
-          <w:b/>
-          <w:bCs/>
-          <w:color w:val="6D28D9"/>
-        </w:rPr>
-        <w:t xml:space="preserve">Adding sections and questions</w:t>
-      </w:r>
-    </w:p>
-    <w:p>
-      <w:pPr>
-        <w:bidi w:val="false"/>
-        <w:spacing w:after="80" w:before="80"/>
-        <w:jc w:val="left"/>
-      </w:pPr>
-      <w:r>
-        <w:rPr>
-          <w:rFonts w:ascii="Arial" w:cs="Arial" w:eastAsia="Arial" w:hAnsi="Arial"/>
-          <w:rtl w:val="false"/>
-        </w:rPr>
-        <w:t xml:space="preserve">Most assessments have one section, but you can add more for reading-comprehension or multi-part exams.</w:t>
-      </w:r>
-    </w:p>
-    <w:p>
-      <w:pPr>
-        <w:pStyle w:val="ListParagraph"/>
-        <w:numPr>
-          <w:ilvl w:val="0"/>
-          <w:numId w:val="2"/>
-        </w:numPr>
-        <w:bidi w:val="false"/>
-        <w:spacing w:after="40" w:before="40"/>
-        <w:jc w:val="left"/>
-      </w:pPr>
-      <w:r>
-        <w:rPr>
-          <w:rtl w:val="false"/>
-        </w:rPr>
-        <w:t xml:space="preserve">Click + Section to add a section. Give it a title (e.g. "Section A — Reading") and instructions students will see.</w:t>
-      </w:r>
-    </w:p>
-    <w:p>
-      <w:pPr>
-        <w:pStyle w:val="ListParagraph"/>
-        <w:numPr>
-          <w:ilvl w:val="0"/>
-          <w:numId w:val="2"/>
-        </w:numPr>
-        <w:bidi w:val="false"/>
-        <w:spacing w:after="40" w:before="40"/>
-        <w:jc w:val="left"/>
-      </w:pPr>
-      <w:r>
-        <w:rPr>
-          <w:rtl w:val="false"/>
-        </w:rPr>
-        <w:t xml:space="preserve">If the section has a reading passage, paste it into the Reading passage / Source text box. The student will see the passage above that section's questions.</w:t>
-      </w:r>
-    </w:p>
-    <w:p>
-      <w:pPr>
-        <w:pStyle w:val="ListParagraph"/>
-        <w:numPr>
-          <w:ilvl w:val="0"/>
-          <w:numId w:val="2"/>
-        </w:numPr>
-        <w:bidi w:val="false"/>
-        <w:spacing w:after="40" w:before="40"/>
-        <w:jc w:val="left"/>
-      </w:pPr>
-      <w:r>
-        <w:rPr>
-          <w:rtl w:val="false"/>
-        </w:rPr>
-        <w:t xml:space="preserve">Click any of the question-type buttons to add a question: + Multiple choice, + True/False, + True/False/Not Given, + Short answer, + Long answer, + Essay (manual grade), + Essay (auto-graded).</w:t>
-      </w:r>
-    </w:p>
-    <w:p>
-      <w:pPr>
-        <w:pStyle w:val="ListParagraph"/>
-        <w:numPr>
-          <w:ilvl w:val="0"/>
-          <w:numId w:val="2"/>
-        </w:numPr>
-        <w:bidi w:val="false"/>
-        <w:spacing w:after="40" w:before="40"/>
-        <w:jc w:val="left"/>
-      </w:pPr>
-      <w:r>
-        <w:rPr>
-          <w:rtl w:val="false"/>
-        </w:rPr>
-        <w:t xml:space="preserve">Fill in the prompt, options, and correct answer for each question.</w:t>
-      </w:r>
-    </w:p>
-    <w:p>
-      <w:pPr>
-        <w:pStyle w:val="ListParagraph"/>
-        <w:numPr>
-          <w:ilvl w:val="0"/>
-          <w:numId w:val="2"/>
-        </w:numPr>
-        <w:bidi w:val="false"/>
-        <w:spacing w:after="40" w:before="40"/>
-        <w:jc w:val="left"/>
-      </w:pPr>
-      <w:r>
-        <w:rPr>
-          <w:rtl w:val="false"/>
-        </w:rPr>
-        <w:t xml:space="preserve">When done, click Save. The builder closes and you return to the dashboard.</w:t>
+        <w:t xml:space="preserve">Click ✎ Edit this assessment in the preview top bar to jump back into the builder if you spot something to fix.</w:t>
       </w:r>
     </w:p>
     <w:p>
@@ -1559,7 +1339,7 @@
         <w:rPr>
           <w:rtl w:val="false"/>
         </w:rPr>
-        <w:t xml:space="preserve">Essay (auto-graded) uses Claude with the rubric you picked. Choose Stage 7 or Stage 8 for IB-style rubrics, or 3–5 / 5–9 for primary/middle.</w:t>
+        <w:t xml:space="preserve">Preview every new assessment once before sharing the link with students. Fastest way to catch typos, missing options, or pairs you forgot to fill in.</w:t>
       </w:r>
     </w:p>
     <w:p>
@@ -1580,7 +1360,7 @@
           <w:bCs/>
           <w:color w:val="1A1E33"/>
         </w:rPr>
-        <w:t xml:space="preserve">8. Reading comprehension — passages with highlighter</w:t>
+        <w:t xml:space="preserve">8. Creating an assessment — manually</w:t>
       </w:r>
     </w:p>
     <w:p>
@@ -1594,7 +1374,20 @@
           <w:rFonts w:ascii="Arial" w:cs="Arial" w:eastAsia="Arial" w:hAnsi="Arial"/>
           <w:rtl w:val="false"/>
         </w:rPr>
-        <w:t xml:space="preserve">When a section has a reading passage, the student sees the passage above the questions during the exam. A vertical yellow highlighter toolbar appears on the left side of the screen.</w:t>
+        <w:t xml:space="preserve">Click + New assessment and then Start from scratch. Fill in the builder.</w:t>
+      </w:r>
+    </w:p>
+    <w:p>
+      <w:pPr>
+        <w:pStyle w:val="Heading3"/>
+      </w:pPr>
+      <w:r>
+        <w:rPr>
+          <w:b/>
+          <w:bCs/>
+          <w:color w:val="6D28D9"/>
+        </w:rPr>
+        <w:t xml:space="preserve">Basic settings</w:t>
       </w:r>
     </w:p>
     <w:p>
@@ -1612,7 +1405,7 @@
         <w:rPr>
           <w:rtl w:val="false"/>
         </w:rPr>
-        <w:t xml:space="preserve">The student can select sentences in the passage with their mouse or finger.</w:t>
+        <w:t xml:space="preserve">Title — what students see at the top of the assessment.</w:t>
       </w:r>
     </w:p>
     <w:p>
@@ -1630,7 +1423,7 @@
         <w:rPr>
           <w:rtl w:val="false"/>
         </w:rPr>
-        <w:t xml:space="preserve">Clicking Highlight wraps the selected text in yellow.</w:t>
+        <w:t xml:space="preserve">Class — which class can take this assessment.</w:t>
       </w:r>
     </w:p>
     <w:p>
@@ -1648,7 +1441,7 @@
         <w:rPr>
           <w:rtl w:val="false"/>
         </w:rPr>
-        <w:t xml:space="preserve">Clicking Erase then a highlighted span removes that highlight.</w:t>
+        <w:t xml:space="preserve">Subject — pick from the dropdown. Listening, IELTS, TOEFL, and PISA enable special audio behaviour (see Section 9).</w:t>
       </w:r>
     </w:p>
     <w:p>
@@ -1666,7 +1459,7 @@
         <w:rPr>
           <w:rtl w:val="false"/>
         </w:rPr>
-        <w:t xml:space="preserve">Clicking Clear all removes every highlight.</w:t>
+        <w:t xml:space="preserve">Language of assessment — tells the AI which language to grade in and which voices to suggest for listening audio.</w:t>
       </w:r>
     </w:p>
     <w:p>
@@ -1684,7 +1477,74 @@
         <w:rPr>
           <w:rtl w:val="false"/>
         </w:rPr>
-        <w:t xml:space="preserve">Highlights persist if the student briefly loses focus or has to resume after re-entry.</w:t>
+        <w:t xml:space="preserve">Grade level, Academic year, Term, Scheduled date.</w:t>
+      </w:r>
+    </w:p>
+    <w:p>
+      <w:pPr>
+        <w:pStyle w:val="ListParagraph"/>
+        <w:numPr>
+          <w:ilvl w:val="0"/>
+          <w:numId w:val="3"/>
+        </w:numPr>
+        <w:bidi w:val="false"/>
+        <w:spacing w:after="40" w:before="40"/>
+        <w:jc w:val="left"/>
+      </w:pPr>
+      <w:r>
+        <w:rPr>
+          <w:rtl w:val="false"/>
+        </w:rPr>
+        <w:t xml:space="preserve">Duration in minutes — the timer the student sees.</w:t>
+      </w:r>
+    </w:p>
+    <w:p>
+      <w:pPr>
+        <w:pStyle w:val="ListParagraph"/>
+        <w:numPr>
+          <w:ilvl w:val="0"/>
+          <w:numId w:val="3"/>
+        </w:numPr>
+        <w:bidi w:val="false"/>
+        <w:spacing w:after="40" w:before="40"/>
+        <w:jc w:val="left"/>
+      </w:pPr>
+      <w:r>
+        <w:rPr>
+          <w:rtl w:val="false"/>
+        </w:rPr>
+        <w:t xml:space="preserve">Delivery mode — Online (webcam mandatory) or On-site (you supervise in person, webcam not required).</w:t>
+      </w:r>
+    </w:p>
+    <w:p>
+      <w:pPr>
+        <w:pStyle w:val="ListParagraph"/>
+        <w:numPr>
+          <w:ilvl w:val="0"/>
+          <w:numId w:val="3"/>
+        </w:numPr>
+        <w:bidi w:val="false"/>
+        <w:spacing w:after="40" w:before="40"/>
+        <w:jc w:val="left"/>
+      </w:pPr>
+      <w:r>
+        <w:rPr>
+          <w:rtl w:val="false"/>
+        </w:rPr>
+        <w:t xml:space="preserve">Published / Draft — only published assessments are visible to students.</w:t>
+      </w:r>
+    </w:p>
+    <w:p>
+      <w:pPr>
+        <w:pStyle w:val="Heading3"/>
+      </w:pPr>
+      <w:r>
+        <w:rPr>
+          <w:b/>
+          <w:bCs/>
+          <w:color w:val="6D28D9"/>
+        </w:rPr>
+        <w:t xml:space="preserve">Adding sections and questions</w:t>
       </w:r>
     </w:p>
     <w:p>
@@ -1698,104 +1558,7 @@
           <w:rFonts w:ascii="Arial" w:cs="Arial" w:eastAsia="Arial" w:hAnsi="Arial"/>
           <w:rtl w:val="false"/>
         </w:rPr>
-        <w:t xml:space="preserve">No setup is needed on your end — the highlighter automatically appears whenever a section has a passage.</w:t>
-      </w:r>
-    </w:p>
-    <w:p>
-      <w:pPr>
-        <w:spacing w:after="100" w:before="100"/>
-      </w:pPr>
-      <w:r>
-        <w:t xml:space="preserve"/>
-      </w:r>
-    </w:p>
-    <w:p>
-      <w:pPr>
-        <w:pStyle w:val="Heading1"/>
-      </w:pPr>
-      <w:r>
-        <w:rPr>
-          <w:b/>
-          <w:bCs/>
-          <w:color w:val="1A1E33"/>
-        </w:rPr>
-        <w:t xml:space="preserve">9. Listening assessments</w:t>
-      </w:r>
-    </w:p>
-    <w:p>
-      <w:pPr>
-        <w:bidi w:val="false"/>
-        <w:spacing w:after="80" w:before="80"/>
-        <w:jc w:val="left"/>
-      </w:pPr>
-      <w:r>
-        <w:rPr>
-          <w:rFonts w:ascii="Arial" w:cs="Arial" w:eastAsia="Arial" w:hAnsi="Arial"/>
-          <w:rtl w:val="false"/>
-        </w:rPr>
-        <w:t xml:space="preserve">ClassCurio supports two ways to give students an audio source: upload your own recording, or let the browser read an AI-generated script aloud. Pick whichever is easier.</w:t>
-      </w:r>
-    </w:p>
-    <w:p>
-      <w:pPr>
-        <w:pStyle w:val="Heading3"/>
-      </w:pPr>
-      <w:r>
-        <w:rPr>
-          <w:b/>
-          <w:bCs/>
-          <w:color w:val="6D28D9"/>
-        </w:rPr>
-        <w:t xml:space="preserve">Subject choices for listening</w:t>
-      </w:r>
-    </w:p>
-    <w:p>
-      <w:pPr>
-        <w:pStyle w:val="ListParagraph"/>
-        <w:numPr>
-          <w:ilvl w:val="0"/>
-          <w:numId w:val="3"/>
-        </w:numPr>
-        <w:bidi w:val="false"/>
-        <w:spacing w:after="40" w:before="40"/>
-        <w:jc w:val="left"/>
-      </w:pPr>
-      <w:r>
-        <w:rPr>
-          <w:rtl w:val="false"/>
-        </w:rPr>
-        <w:t xml:space="preserve">Listening — practice mode. Students can play the audio TWICE.</w:t>
-      </w:r>
-    </w:p>
-    <w:p>
-      <w:pPr>
-        <w:pStyle w:val="ListParagraph"/>
-        <w:numPr>
-          <w:ilvl w:val="0"/>
-          <w:numId w:val="3"/>
-        </w:numPr>
-        <w:bidi w:val="false"/>
-        <w:spacing w:after="40" w:before="40"/>
-        <w:jc w:val="left"/>
-      </w:pPr>
-      <w:r>
-        <w:rPr>
-          <w:rtl w:val="false"/>
-        </w:rPr>
-        <w:t xml:space="preserve">IELTS, TOEFL, PISA — official exam mode. Students can play the audio ONCE only, no replays.</w:t>
-      </w:r>
-    </w:p>
-    <w:p>
-      <w:pPr>
-        <w:pStyle w:val="Heading3"/>
-      </w:pPr>
-      <w:r>
-        <w:rPr>
-          <w:b/>
-          <w:bCs/>
-          <w:color w:val="6D28D9"/>
-        </w:rPr>
-        <w:t xml:space="preserve">Option A — Upload your own MP3 (or M4A / WAV / OGG / AAC)</w:t>
+        <w:t xml:space="preserve">Most assessments have one section, but you can add more for reading-comprehension or multi-part exams.</w:t>
       </w:r>
     </w:p>
     <w:p>
@@ -1813,7 +1576,7 @@
         <w:rPr>
           <w:rtl w:val="false"/>
         </w:rPr>
-        <w:t xml:space="preserve">Create or edit the assessment. Save it first.</w:t>
+        <w:t xml:space="preserve">Click + Section to add a section. Give it a title (e.g. "Section A — Reading") and instructions students will see.</w:t>
       </w:r>
     </w:p>
     <w:p>
@@ -1831,7 +1594,7 @@
         <w:rPr>
           <w:rtl w:val="false"/>
         </w:rPr>
-        <w:t xml:space="preserve">Scroll to the 🎧 Listening audio panel.</w:t>
+        <w:t xml:space="preserve">If the section has a reading passage, paste it into the Reading passage / Source text box. The student will see the passage above that section's questions.</w:t>
       </w:r>
     </w:p>
     <w:p>
@@ -1849,7 +1612,7 @@
         <w:rPr>
           <w:rtl w:val="false"/>
         </w:rPr>
-        <w:t xml:space="preserve">Click Choose File, pick your audio (max 50 MB), and click Upload audio.</w:t>
+        <w:t xml:space="preserve">Click any of the question-type buttons to add a question: + Multiple choice, + True/False, + True/False/Not Given, + Short answer, + Long answer, + Essay (manual grade), + Essay (auto-graded).</w:t>
       </w:r>
     </w:p>
     <w:p>
@@ -1867,20 +1630,7 @@
         <w:rPr>
           <w:rtl w:val="false"/>
         </w:rPr>
-        <w:t xml:space="preserve">A small preview player appears so you can verify it works. Save the assessment.</w:t>
-      </w:r>
-    </w:p>
-    <w:p>
-      <w:pPr>
-        <w:pStyle w:val="Heading3"/>
-      </w:pPr>
-      <w:r>
-        <w:rPr>
-          <w:b/>
-          <w:bCs/>
-          <w:color w:val="6D28D9"/>
-        </w:rPr>
-        <w:t xml:space="preserve">Option B — Use the free AI voice (no file needed)</w:t>
+        <w:t xml:space="preserve">Fill in the prompt, options, and correct answer for each question.</w:t>
       </w:r>
     </w:p>
     <w:p>
@@ -1898,97 +1648,7 @@
         <w:rPr>
           <w:rtl w:val="false"/>
         </w:rPr>
-        <w:t xml:space="preserve">In the 🎧 Listening audio panel, click ✨ Generate script with AI. After about 10 seconds the textarea fills with a transcript that matches your questions.</w:t>
-      </w:r>
-    </w:p>
-    <w:p>
-      <w:pPr>
-        <w:pStyle w:val="ListParagraph"/>
-        <w:numPr>
-          <w:ilvl w:val="0"/>
-          <w:numId w:val="2"/>
-        </w:numPr>
-        <w:bidi w:val="false"/>
-        <w:spacing w:after="40" w:before="40"/>
-        <w:jc w:val="left"/>
-      </w:pPr>
-      <w:r>
-        <w:rPr>
-          <w:rtl w:val="false"/>
-        </w:rPr>
-        <w:t xml:space="preserve">The 🎭 Speakers panel detects every speaker label in the script (Speaker 1, Speaker 2, Sarah, Dr. Khan, etc.) and shows one voice dropdown per speaker. By default, distinct voices are auto-assigned.</w:t>
-      </w:r>
-    </w:p>
-    <w:p>
-      <w:pPr>
-        <w:pStyle w:val="ListParagraph"/>
-        <w:numPr>
-          <w:ilvl w:val="0"/>
-          <w:numId w:val="2"/>
-        </w:numPr>
-        <w:bidi w:val="false"/>
-        <w:spacing w:after="40" w:before="40"/>
-        <w:jc w:val="left"/>
-      </w:pPr>
-      <w:r>
-        <w:rPr>
-          <w:rtl w:val="false"/>
-        </w:rPr>
-        <w:t xml:space="preserve">Pick a voice for each speaker — the dropdown lists the most humanistic voices first.</w:t>
-      </w:r>
-    </w:p>
-    <w:p>
-      <w:pPr>
-        <w:pStyle w:val="ListParagraph"/>
-        <w:numPr>
-          <w:ilvl w:val="0"/>
-          <w:numId w:val="2"/>
-        </w:numPr>
-        <w:bidi w:val="false"/>
-        <w:spacing w:after="40" w:before="40"/>
-        <w:jc w:val="left"/>
-      </w:pPr>
-      <w:r>
-        <w:rPr>
-          <w:rtl w:val="false"/>
-        </w:rPr>
-        <w:t xml:space="preserve">Pick the default narration voice for any unlabelled paragraphs.</w:t>
-      </w:r>
-    </w:p>
-    <w:p>
-      <w:pPr>
-        <w:pStyle w:val="ListParagraph"/>
-        <w:numPr>
-          <w:ilvl w:val="0"/>
-          <w:numId w:val="2"/>
-        </w:numPr>
-        <w:bidi w:val="false"/>
-        <w:spacing w:after="40" w:before="40"/>
-        <w:jc w:val="left"/>
-      </w:pPr>
-      <w:r>
-        <w:rPr>
-          <w:rtl w:val="false"/>
-        </w:rPr>
-        <w:t xml:space="preserve">Click 🔊 Test play to preview. The browser reads each speaker's turn in their own voice.</w:t>
-      </w:r>
-    </w:p>
-    <w:p>
-      <w:pPr>
-        <w:pStyle w:val="ListParagraph"/>
-        <w:numPr>
-          <w:ilvl w:val="0"/>
-          <w:numId w:val="2"/>
-        </w:numPr>
-        <w:bidi w:val="false"/>
-        <w:spacing w:after="40" w:before="40"/>
-        <w:jc w:val="left"/>
-      </w:pPr>
-      <w:r>
-        <w:rPr>
-          <w:rtl w:val="false"/>
-        </w:rPr>
-        <w:t xml:space="preserve">Click Use AI voice (or just click Save) to persist the script and voice assignments.</w:t>
+        <w:t xml:space="preserve">When done, click Save. The builder closes and you return to the dashboard.</w:t>
       </w:r>
     </w:p>
     <w:p>
@@ -2013,7 +1673,181 @@
         <w:rPr>
           <w:rtl w:val="false"/>
         </w:rPr>
-        <w:t xml:space="preserve">On Mac, download Premium voices in System Settings → Accessibility → Spoken Content for more natural sound. On Windows, Edge's Microsoft Natural voices sound almost human.</w:t>
+        <w:t xml:space="preserve">Essay (auto-graded) uses Claude with the rubric you picked. Choose Stage 7 or Stage 8 for IB-style rubrics, or 3–5 / 5–9 for primary/middle.</w:t>
+      </w:r>
+    </w:p>
+    <w:p>
+      <w:pPr>
+        <w:spacing w:after="100" w:before="100"/>
+      </w:pPr>
+      <w:r>
+        <w:t xml:space="preserve"/>
+      </w:r>
+    </w:p>
+    <w:p>
+      <w:pPr>
+        <w:pStyle w:val="Heading1"/>
+      </w:pPr>
+      <w:r>
+        <w:rPr>
+          <w:b/>
+          <w:bCs/>
+          <w:color w:val="1A1E33"/>
+        </w:rPr>
+        <w:t xml:space="preserve">9. Reading comprehension — passages with highlighter</w:t>
+      </w:r>
+    </w:p>
+    <w:p>
+      <w:pPr>
+        <w:bidi w:val="false"/>
+        <w:spacing w:after="80" w:before="80"/>
+        <w:jc w:val="left"/>
+      </w:pPr>
+      <w:r>
+        <w:rPr>
+          <w:rFonts w:ascii="Arial" w:cs="Arial" w:eastAsia="Arial" w:hAnsi="Arial"/>
+          <w:rtl w:val="false"/>
+        </w:rPr>
+        <w:t xml:space="preserve">When a section has a reading passage, the student sees the passage above the questions during the exam. A vertical yellow highlighter toolbar appears on the left side of the screen.</w:t>
+      </w:r>
+    </w:p>
+    <w:p>
+      <w:pPr>
+        <w:pStyle w:val="ListParagraph"/>
+        <w:numPr>
+          <w:ilvl w:val="0"/>
+          <w:numId w:val="3"/>
+        </w:numPr>
+        <w:bidi w:val="false"/>
+        <w:spacing w:after="40" w:before="40"/>
+        <w:jc w:val="left"/>
+      </w:pPr>
+      <w:r>
+        <w:rPr>
+          <w:rtl w:val="false"/>
+        </w:rPr>
+        <w:t xml:space="preserve">The student can select sentences in the passage with their mouse or finger.</w:t>
+      </w:r>
+    </w:p>
+    <w:p>
+      <w:pPr>
+        <w:pStyle w:val="ListParagraph"/>
+        <w:numPr>
+          <w:ilvl w:val="0"/>
+          <w:numId w:val="3"/>
+        </w:numPr>
+        <w:bidi w:val="false"/>
+        <w:spacing w:after="40" w:before="40"/>
+        <w:jc w:val="left"/>
+      </w:pPr>
+      <w:r>
+        <w:rPr>
+          <w:rtl w:val="false"/>
+        </w:rPr>
+        <w:t xml:space="preserve">Clicking Highlight wraps the selected text in yellow.</w:t>
+      </w:r>
+    </w:p>
+    <w:p>
+      <w:pPr>
+        <w:pStyle w:val="ListParagraph"/>
+        <w:numPr>
+          <w:ilvl w:val="0"/>
+          <w:numId w:val="3"/>
+        </w:numPr>
+        <w:bidi w:val="false"/>
+        <w:spacing w:after="40" w:before="40"/>
+        <w:jc w:val="left"/>
+      </w:pPr>
+      <w:r>
+        <w:rPr>
+          <w:rtl w:val="false"/>
+        </w:rPr>
+        <w:t xml:space="preserve">Clicking Erase then a highlighted span removes that highlight.</w:t>
+      </w:r>
+    </w:p>
+    <w:p>
+      <w:pPr>
+        <w:pStyle w:val="ListParagraph"/>
+        <w:numPr>
+          <w:ilvl w:val="0"/>
+          <w:numId w:val="3"/>
+        </w:numPr>
+        <w:bidi w:val="false"/>
+        <w:spacing w:after="40" w:before="40"/>
+        <w:jc w:val="left"/>
+      </w:pPr>
+      <w:r>
+        <w:rPr>
+          <w:rtl w:val="false"/>
+        </w:rPr>
+        <w:t xml:space="preserve">Clicking Clear all removes every highlight.</w:t>
+      </w:r>
+    </w:p>
+    <w:p>
+      <w:pPr>
+        <w:pStyle w:val="ListParagraph"/>
+        <w:numPr>
+          <w:ilvl w:val="0"/>
+          <w:numId w:val="3"/>
+        </w:numPr>
+        <w:bidi w:val="false"/>
+        <w:spacing w:after="40" w:before="40"/>
+        <w:jc w:val="left"/>
+      </w:pPr>
+      <w:r>
+        <w:rPr>
+          <w:rtl w:val="false"/>
+        </w:rPr>
+        <w:t xml:space="preserve">Highlights persist if the student briefly loses focus or has to resume after re-entry.</w:t>
+      </w:r>
+    </w:p>
+    <w:p>
+      <w:pPr>
+        <w:bidi w:val="false"/>
+        <w:spacing w:after="80" w:before="80"/>
+        <w:jc w:val="left"/>
+      </w:pPr>
+      <w:r>
+        <w:rPr>
+          <w:rFonts w:ascii="Arial" w:cs="Arial" w:eastAsia="Arial" w:hAnsi="Arial"/>
+          <w:rtl w:val="false"/>
+        </w:rPr>
+        <w:t xml:space="preserve">No setup is needed on your end — the highlighter automatically appears whenever a section has a passage.</w:t>
+      </w:r>
+    </w:p>
+    <w:p>
+      <w:pPr>
+        <w:spacing w:after="100" w:before="100"/>
+      </w:pPr>
+      <w:r>
+        <w:t xml:space="preserve"/>
+      </w:r>
+    </w:p>
+    <w:p>
+      <w:pPr>
+        <w:pStyle w:val="Heading1"/>
+      </w:pPr>
+      <w:r>
+        <w:rPr>
+          <w:b/>
+          <w:bCs/>
+          <w:color w:val="1A1E33"/>
+        </w:rPr>
+        <w:t xml:space="preserve">10. Listening assessments</w:t>
+      </w:r>
+    </w:p>
+    <w:p>
+      <w:pPr>
+        <w:bidi w:val="false"/>
+        <w:spacing w:after="80" w:before="80"/>
+        <w:jc w:val="left"/>
+      </w:pPr>
+      <w:r>
+        <w:rPr>
+          <w:rFonts w:ascii="Arial" w:cs="Arial" w:eastAsia="Arial" w:hAnsi="Arial"/>
+          <w:rtl w:val="false"/>
+        </w:rPr>
+        <w:t xml:space="preserve">ClassCurio supports two ways to give students an audio source: upload your own recording, or let the browser read an AI-generated script aloud. Pick whichever is easier.</w:t>
       </w:r>
     </w:p>
     <w:p>
@@ -2026,56 +1860,43 @@
           <w:bCs/>
           <w:color w:val="6D28D9"/>
         </w:rPr>
-        <w:t xml:space="preserve">What the student sees</w:t>
-      </w:r>
-    </w:p>
-    <w:p>
-      <w:pPr>
-        <w:bidi w:val="false"/>
-        <w:spacing w:after="80" w:before="80"/>
-        <w:jc w:val="left"/>
-      </w:pPr>
-      <w:r>
-        <w:rPr>
-          <w:rFonts w:ascii="Arial" w:cs="Arial" w:eastAsia="Arial" w:hAnsi="Arial"/>
-          <w:rtl w:val="false"/>
-        </w:rPr>
-        <w:t xml:space="preserve">A yellow Listening audio bar pinned to the top of the assessment view, with a single ▶ Play button. After the audio finishes, the bar shows how many plays remain. The button locks when the cap is reached. The audio cannot be paused or stopped mid-stream.</w:t>
-      </w:r>
-    </w:p>
-    <w:p>
-      <w:pPr>
-        <w:spacing w:after="100" w:before="100"/>
-      </w:pPr>
-      <w:r>
-        <w:t xml:space="preserve"/>
-      </w:r>
-    </w:p>
-    <w:p>
-      <w:pPr>
-        <w:pStyle w:val="Heading1"/>
-      </w:pPr>
-      <w:r>
-        <w:rPr>
-          <w:b/>
-          <w:bCs/>
-          <w:color w:val="1A1E33"/>
-        </w:rPr>
-        <w:t xml:space="preserve">10. Lockdown rules and violations</w:t>
-      </w:r>
-    </w:p>
-    <w:p>
-      <w:pPr>
-        <w:bidi w:val="false"/>
-        <w:spacing w:after="80" w:before="80"/>
-        <w:jc w:val="left"/>
-      </w:pPr>
-      <w:r>
-        <w:rPr>
-          <w:rFonts w:ascii="Arial" w:cs="Arial" w:eastAsia="Arial" w:hAnsi="Arial"/>
-          <w:rtl w:val="false"/>
-        </w:rPr>
-        <w:t xml:space="preserve">Every assessment is protected by a lockdown layer. Students cannot copy, paste, right-click, take screenshots (where the OS allows browsers to block them), open another window, or leave full-screen.</w:t>
+        <w:t xml:space="preserve">Subject choices for listening</w:t>
+      </w:r>
+    </w:p>
+    <w:p>
+      <w:pPr>
+        <w:pStyle w:val="ListParagraph"/>
+        <w:numPr>
+          <w:ilvl w:val="0"/>
+          <w:numId w:val="3"/>
+        </w:numPr>
+        <w:bidi w:val="false"/>
+        <w:spacing w:after="40" w:before="40"/>
+        <w:jc w:val="left"/>
+      </w:pPr>
+      <w:r>
+        <w:rPr>
+          <w:rtl w:val="false"/>
+        </w:rPr>
+        <w:t xml:space="preserve">Listening — practice mode. Students can play the audio TWICE.</w:t>
+      </w:r>
+    </w:p>
+    <w:p>
+      <w:pPr>
+        <w:pStyle w:val="ListParagraph"/>
+        <w:numPr>
+          <w:ilvl w:val="0"/>
+          <w:numId w:val="3"/>
+        </w:numPr>
+        <w:bidi w:val="false"/>
+        <w:spacing w:after="40" w:before="40"/>
+        <w:jc w:val="left"/>
+      </w:pPr>
+      <w:r>
+        <w:rPr>
+          <w:rtl w:val="false"/>
+        </w:rPr>
+        <w:t xml:space="preserve">IELTS, TOEFL, PISA — official exam mode. Students can play the audio ONCE only, no replays.</w:t>
       </w:r>
     </w:p>
     <w:p>
@@ -2088,129 +1909,79 @@
           <w:bCs/>
           <w:color w:val="6D28D9"/>
         </w:rPr>
-        <w:t xml:space="preserve">Three-violation rule</w:t>
-      </w:r>
-    </w:p>
-    <w:p>
-      <w:pPr>
-        <w:bidi w:val="false"/>
-        <w:spacing w:after="80" w:before="80"/>
-        <w:jc w:val="left"/>
-      </w:pPr>
-      <w:r>
-        <w:rPr>
-          <w:rFonts w:ascii="Arial" w:cs="Arial" w:eastAsia="Arial" w:hAnsi="Arial"/>
-          <w:rtl w:val="false"/>
-        </w:rPr>
-        <w:t xml:space="preserve">Each violation counts as one strike. On the third strike, the assessment is auto-submitted and the student is logged out. Examples of violations:</w:t>
-      </w:r>
-    </w:p>
-    <w:p>
-      <w:pPr>
-        <w:pStyle w:val="ListParagraph"/>
-        <w:numPr>
-          <w:ilvl w:val="0"/>
-          <w:numId w:val="3"/>
-        </w:numPr>
-        <w:bidi w:val="false"/>
-        <w:spacing w:after="40" w:before="40"/>
-        <w:jc w:val="left"/>
-      </w:pPr>
-      <w:r>
-        <w:rPr>
-          <w:rtl w:val="false"/>
-        </w:rPr>
-        <w:t xml:space="preserve">Tab switch / Cmd+Tab / minimise — 1 strike.</w:t>
-      </w:r>
-    </w:p>
-    <w:p>
-      <w:pPr>
-        <w:pStyle w:val="ListParagraph"/>
-        <w:numPr>
-          <w:ilvl w:val="0"/>
-          <w:numId w:val="3"/>
-        </w:numPr>
-        <w:bidi w:val="false"/>
-        <w:spacing w:after="40" w:before="40"/>
-        <w:jc w:val="left"/>
-      </w:pPr>
-      <w:r>
-        <w:rPr>
-          <w:rtl w:val="false"/>
-        </w:rPr>
-        <w:t xml:space="preserve">Window loses focus — 1 strike.</w:t>
-      </w:r>
-    </w:p>
-    <w:p>
-      <w:pPr>
-        <w:pStyle w:val="ListParagraph"/>
-        <w:numPr>
-          <w:ilvl w:val="0"/>
-          <w:numId w:val="3"/>
-        </w:numPr>
-        <w:bidi w:val="false"/>
-        <w:spacing w:after="40" w:before="40"/>
-        <w:jc w:val="left"/>
-      </w:pPr>
-      <w:r>
-        <w:rPr>
-          <w:rtl w:val="false"/>
-        </w:rPr>
-        <w:t xml:space="preserve">Exit full-screen — 1 strike.</w:t>
-      </w:r>
-    </w:p>
-    <w:p>
-      <w:pPr>
-        <w:pStyle w:val="ListParagraph"/>
-        <w:numPr>
-          <w:ilvl w:val="0"/>
-          <w:numId w:val="3"/>
-        </w:numPr>
-        <w:bidi w:val="false"/>
-        <w:spacing w:after="40" w:before="40"/>
-        <w:jc w:val="left"/>
-      </w:pPr>
-      <w:r>
-        <w:rPr>
-          <w:rtl w:val="false"/>
-        </w:rPr>
-        <w:t xml:space="preserve">Press a screenshot shortcut (PrintScreen, Cmd+Shift+S, etc.) — 1 strike.</w:t>
-      </w:r>
-    </w:p>
-    <w:p>
-      <w:pPr>
-        <w:pStyle w:val="ListParagraph"/>
-        <w:numPr>
-          <w:ilvl w:val="0"/>
-          <w:numId w:val="3"/>
-        </w:numPr>
-        <w:bidi w:val="false"/>
-        <w:spacing w:after="40" w:before="40"/>
-        <w:jc w:val="left"/>
-      </w:pPr>
-      <w:r>
-        <w:rPr>
-          <w:rtl w:val="false"/>
-        </w:rPr>
-        <w:t xml:space="preserve">Webcam turned off / covered / muted — 1 strike (online mode only).</w:t>
-      </w:r>
-    </w:p>
-    <w:p>
-      <w:pPr>
-        <w:pStyle w:val="ListParagraph"/>
-        <w:numPr>
-          <w:ilvl w:val="0"/>
-          <w:numId w:val="3"/>
-        </w:numPr>
-        <w:bidi w:val="false"/>
-        <w:spacing w:after="40" w:before="40"/>
-        <w:jc w:val="left"/>
-      </w:pPr>
-      <w:r>
-        <w:rPr>
-          <w:rtl w:val="false"/>
-        </w:rPr>
-        <w:t xml:space="preserve">Different face / no face visible — 1 strike (online mode only).</w:t>
+        <w:t xml:space="preserve">Option A — Upload your own MP3 (or M4A / WAV / OGG / AAC)</w:t>
+      </w:r>
+    </w:p>
+    <w:p>
+      <w:pPr>
+        <w:pStyle w:val="ListParagraph"/>
+        <w:numPr>
+          <w:ilvl w:val="0"/>
+          <w:numId w:val="2"/>
+        </w:numPr>
+        <w:bidi w:val="false"/>
+        <w:spacing w:after="40" w:before="40"/>
+        <w:jc w:val="left"/>
+      </w:pPr>
+      <w:r>
+        <w:rPr>
+          <w:rtl w:val="false"/>
+        </w:rPr>
+        <w:t xml:space="preserve">Create or edit the assessment. Save it first.</w:t>
+      </w:r>
+    </w:p>
+    <w:p>
+      <w:pPr>
+        <w:pStyle w:val="ListParagraph"/>
+        <w:numPr>
+          <w:ilvl w:val="0"/>
+          <w:numId w:val="2"/>
+        </w:numPr>
+        <w:bidi w:val="false"/>
+        <w:spacing w:after="40" w:before="40"/>
+        <w:jc w:val="left"/>
+      </w:pPr>
+      <w:r>
+        <w:rPr>
+          <w:rtl w:val="false"/>
+        </w:rPr>
+        <w:t xml:space="preserve">Scroll to the 🎧 Listening audio panel.</w:t>
+      </w:r>
+    </w:p>
+    <w:p>
+      <w:pPr>
+        <w:pStyle w:val="ListParagraph"/>
+        <w:numPr>
+          <w:ilvl w:val="0"/>
+          <w:numId w:val="2"/>
+        </w:numPr>
+        <w:bidi w:val="false"/>
+        <w:spacing w:after="40" w:before="40"/>
+        <w:jc w:val="left"/>
+      </w:pPr>
+      <w:r>
+        <w:rPr>
+          <w:rtl w:val="false"/>
+        </w:rPr>
+        <w:t xml:space="preserve">Click Choose File, pick your audio (max 50 MB), and click Upload audio.</w:t>
+      </w:r>
+    </w:p>
+    <w:p>
+      <w:pPr>
+        <w:pStyle w:val="ListParagraph"/>
+        <w:numPr>
+          <w:ilvl w:val="0"/>
+          <w:numId w:val="2"/>
+        </w:numPr>
+        <w:bidi w:val="false"/>
+        <w:spacing w:after="40" w:before="40"/>
+        <w:jc w:val="left"/>
+      </w:pPr>
+      <w:r>
+        <w:rPr>
+          <w:rtl w:val="false"/>
+        </w:rPr>
+        <w:t xml:space="preserve">A small preview player appears so you can verify it works. Save the assessment.</w:t>
       </w:r>
     </w:p>
     <w:p>
@@ -2223,21 +1994,115 @@
           <w:bCs/>
           <w:color w:val="6D28D9"/>
         </w:rPr>
-        <w:t xml:space="preserve">Webcam proctoring (online mode only)</w:t>
-      </w:r>
-    </w:p>
-    <w:p>
-      <w:pPr>
-        <w:bidi w:val="false"/>
-        <w:spacing w:after="80" w:before="80"/>
-        <w:jc w:val="left"/>
-      </w:pPr>
-      <w:r>
-        <w:rPr>
-          <w:rFonts w:ascii="Arial" w:cs="Arial" w:eastAsia="Arial" w:hAnsi="Arial"/>
-          <w:rtl w:val="false"/>
-        </w:rPr>
-        <w:t xml:space="preserve">Online assessments require the student to grant webcam access at the start. Identity is checked roughly every 15 seconds. Talking, multiple people in the frame, and phones pointed at the screen are all flagged.</w:t>
+        <w:t xml:space="preserve">Option B — Use the free AI voice (no file needed)</w:t>
+      </w:r>
+    </w:p>
+    <w:p>
+      <w:pPr>
+        <w:pStyle w:val="ListParagraph"/>
+        <w:numPr>
+          <w:ilvl w:val="0"/>
+          <w:numId w:val="2"/>
+        </w:numPr>
+        <w:bidi w:val="false"/>
+        <w:spacing w:after="40" w:before="40"/>
+        <w:jc w:val="left"/>
+      </w:pPr>
+      <w:r>
+        <w:rPr>
+          <w:rtl w:val="false"/>
+        </w:rPr>
+        <w:t xml:space="preserve">In the 🎧 Listening audio panel, click ✨ Generate script with AI. After about 10 seconds the textarea fills with a transcript that matches your questions.</w:t>
+      </w:r>
+    </w:p>
+    <w:p>
+      <w:pPr>
+        <w:pStyle w:val="ListParagraph"/>
+        <w:numPr>
+          <w:ilvl w:val="0"/>
+          <w:numId w:val="2"/>
+        </w:numPr>
+        <w:bidi w:val="false"/>
+        <w:spacing w:after="40" w:before="40"/>
+        <w:jc w:val="left"/>
+      </w:pPr>
+      <w:r>
+        <w:rPr>
+          <w:rtl w:val="false"/>
+        </w:rPr>
+        <w:t xml:space="preserve">The 🎭 Speakers panel detects every speaker label in the script (Speaker 1, Speaker 2, Sarah, Dr. Khan, etc.) and shows one voice dropdown per speaker. By default, distinct voices are auto-assigned.</w:t>
+      </w:r>
+    </w:p>
+    <w:p>
+      <w:pPr>
+        <w:pStyle w:val="ListParagraph"/>
+        <w:numPr>
+          <w:ilvl w:val="0"/>
+          <w:numId w:val="2"/>
+        </w:numPr>
+        <w:bidi w:val="false"/>
+        <w:spacing w:after="40" w:before="40"/>
+        <w:jc w:val="left"/>
+      </w:pPr>
+      <w:r>
+        <w:rPr>
+          <w:rtl w:val="false"/>
+        </w:rPr>
+        <w:t xml:space="preserve">Pick a voice for each speaker — the dropdown lists the most humanistic voices first.</w:t>
+      </w:r>
+    </w:p>
+    <w:p>
+      <w:pPr>
+        <w:pStyle w:val="ListParagraph"/>
+        <w:numPr>
+          <w:ilvl w:val="0"/>
+          <w:numId w:val="2"/>
+        </w:numPr>
+        <w:bidi w:val="false"/>
+        <w:spacing w:after="40" w:before="40"/>
+        <w:jc w:val="left"/>
+      </w:pPr>
+      <w:r>
+        <w:rPr>
+          <w:rtl w:val="false"/>
+        </w:rPr>
+        <w:t xml:space="preserve">Pick the default narration voice for any unlabelled paragraphs.</w:t>
+      </w:r>
+    </w:p>
+    <w:p>
+      <w:pPr>
+        <w:pStyle w:val="ListParagraph"/>
+        <w:numPr>
+          <w:ilvl w:val="0"/>
+          <w:numId w:val="2"/>
+        </w:numPr>
+        <w:bidi w:val="false"/>
+        <w:spacing w:after="40" w:before="40"/>
+        <w:jc w:val="left"/>
+      </w:pPr>
+      <w:r>
+        <w:rPr>
+          <w:rtl w:val="false"/>
+        </w:rPr>
+        <w:t xml:space="preserve">Click 🔊 Test play to preview. The browser reads each speaker's turn in their own voice.</w:t>
+      </w:r>
+    </w:p>
+    <w:p>
+      <w:pPr>
+        <w:pStyle w:val="ListParagraph"/>
+        <w:numPr>
+          <w:ilvl w:val="0"/>
+          <w:numId w:val="2"/>
+        </w:numPr>
+        <w:bidi w:val="false"/>
+        <w:spacing w:after="40" w:before="40"/>
+        <w:jc w:val="left"/>
+      </w:pPr>
+      <w:r>
+        <w:rPr>
+          <w:rtl w:val="false"/>
+        </w:rPr>
+        <w:t xml:space="preserve">Click Use AI voice (or just click Save) to persist the script and voice assignments.</w:t>
       </w:r>
     </w:p>
     <w:p>
@@ -2262,7 +2127,34 @@
         <w:rPr>
           <w:rtl w:val="false"/>
         </w:rPr>
-        <w:t xml:space="preserve">To completely block screenshots on macOS, students must take the assessment in the ClassCurio desktop app. The browser cannot fully block macOS's system screenshot keys.</w:t>
+        <w:t xml:space="preserve">On Mac, download Premium voices in System Settings → Accessibility → Spoken Content for more natural sound. On Windows, Edge's Microsoft Natural voices sound almost human.</w:t>
+      </w:r>
+    </w:p>
+    <w:p>
+      <w:pPr>
+        <w:pStyle w:val="Heading3"/>
+      </w:pPr>
+      <w:r>
+        <w:rPr>
+          <w:b/>
+          <w:bCs/>
+          <w:color w:val="6D28D9"/>
+        </w:rPr>
+        <w:t xml:space="preserve">What the student sees</w:t>
+      </w:r>
+    </w:p>
+    <w:p>
+      <w:pPr>
+        <w:bidi w:val="false"/>
+        <w:spacing w:after="80" w:before="80"/>
+        <w:jc w:val="left"/>
+      </w:pPr>
+      <w:r>
+        <w:rPr>
+          <w:rFonts w:ascii="Arial" w:cs="Arial" w:eastAsia="Arial" w:hAnsi="Arial"/>
+          <w:rtl w:val="false"/>
+        </w:rPr>
+        <w:t xml:space="preserve">A yellow Listening audio bar pinned to the top of the assessment view, with a single ▶ Play button. After the audio finishes, the bar shows how many plays remain. The button locks when the cap is reached. The audio cannot be paused or stopped mid-stream.</w:t>
       </w:r>
     </w:p>
     <w:p>
@@ -2283,79 +2175,21 @@
           <w:bCs/>
           <w:color w:val="1A1E33"/>
         </w:rPr>
-        <w:t xml:space="preserve">11. Sharing the assessment with students</w:t>
-      </w:r>
-    </w:p>
-    <w:p>
-      <w:pPr>
-        <w:pStyle w:val="ListParagraph"/>
-        <w:numPr>
-          <w:ilvl w:val="0"/>
-          <w:numId w:val="2"/>
-        </w:numPr>
-        <w:bidi w:val="false"/>
-        <w:spacing w:after="40" w:before="40"/>
-        <w:jc w:val="left"/>
-      </w:pPr>
-      <w:r>
-        <w:rPr>
-          <w:rtl w:val="false"/>
-        </w:rPr>
-        <w:t xml:space="preserve">Make sure the assessment is set to Published in the builder.</w:t>
-      </w:r>
-    </w:p>
-    <w:p>
-      <w:pPr>
-        <w:pStyle w:val="ListParagraph"/>
-        <w:numPr>
-          <w:ilvl w:val="0"/>
-          <w:numId w:val="2"/>
-        </w:numPr>
-        <w:bidi w:val="false"/>
-        <w:spacing w:after="40" w:before="40"/>
-        <w:jc w:val="left"/>
-      </w:pPr>
-      <w:r>
-        <w:rPr>
-          <w:rtl w:val="false"/>
-        </w:rPr>
-        <w:t xml:space="preserve">On the dashboard, click 🔗 Share with students on the assessment card.</w:t>
-      </w:r>
-    </w:p>
-    <w:p>
-      <w:pPr>
-        <w:pStyle w:val="ListParagraph"/>
-        <w:numPr>
-          <w:ilvl w:val="0"/>
-          <w:numId w:val="2"/>
-        </w:numPr>
-        <w:bidi w:val="false"/>
-        <w:spacing w:after="40" w:before="40"/>
-        <w:jc w:val="left"/>
-      </w:pPr>
-      <w:r>
-        <w:rPr>
-          <w:rtl w:val="false"/>
-        </w:rPr>
-        <w:t xml:space="preserve">A panel appears with a link. Click Copy, then paste the link in your classroom chat (WhatsApp, Email, Teams, etc.).</w:t>
-      </w:r>
-    </w:p>
-    <w:p>
-      <w:pPr>
-        <w:pStyle w:val="ListParagraph"/>
-        <w:numPr>
-          <w:ilvl w:val="0"/>
-          <w:numId w:val="2"/>
-        </w:numPr>
-        <w:bidi w:val="false"/>
-        <w:spacing w:after="40" w:before="40"/>
-        <w:jc w:val="left"/>
-      </w:pPr>
-      <w:r>
-        <w:rPr>
-          <w:rtl w:val="false"/>
-        </w:rPr>
-        <w:t xml:space="preserve">Students click the link, sign in (or register if first time), and start the assessment.</w:t>
+        <w:t xml:space="preserve">11. Lockdown rules and violations</w:t>
+      </w:r>
+    </w:p>
+    <w:p>
+      <w:pPr>
+        <w:bidi w:val="false"/>
+        <w:spacing w:after="80" w:before="80"/>
+        <w:jc w:val="left"/>
+      </w:pPr>
+      <w:r>
+        <w:rPr>
+          <w:rFonts w:ascii="Arial" w:cs="Arial" w:eastAsia="Arial" w:hAnsi="Arial"/>
+          <w:rtl w:val="false"/>
+        </w:rPr>
+        <w:t xml:space="preserve">Every assessment is protected by a lockdown layer. Students cannot copy, paste, right-click, take screenshots (where the OS allows browsers to block them), open another window, or leave full-screen.</w:t>
       </w:r>
     </w:p>
     <w:p>
@@ -2368,7 +2202,7 @@
           <w:bCs/>
           <w:color w:val="6D28D9"/>
         </w:rPr>
-        <w:t xml:space="preserve">Sharing with another teacher</w:t>
+        <w:t xml:space="preserve">Three-violation rule</w:t>
       </w:r>
     </w:p>
     <w:p>
@@ -2382,118 +2216,115 @@
           <w:rFonts w:ascii="Arial" w:cs="Arial" w:eastAsia="Arial" w:hAnsi="Arial"/>
           <w:rtl w:val="false"/>
         </w:rPr>
-        <w:t xml:space="preserve">Click 🤝 Share with teacher to generate a teacher-only preview link. The receiving teacher can preview, print, or Duplicate into their own class with one click.</w:t>
-      </w:r>
-    </w:p>
-    <w:p>
-      <w:pPr>
-        <w:spacing w:after="100" w:before="100"/>
-      </w:pPr>
-      <w:r>
-        <w:t xml:space="preserve"/>
-      </w:r>
-    </w:p>
-    <w:p>
-      <w:pPr>
-        <w:pStyle w:val="Heading1"/>
-      </w:pPr>
-      <w:r>
-        <w:rPr>
-          <w:b/>
-          <w:bCs/>
-          <w:color w:val="1A1E33"/>
-        </w:rPr>
-        <w:t xml:space="preserve">12. Viewing results and analytics</w:t>
-      </w:r>
-    </w:p>
-    <w:p>
-      <w:pPr>
-        <w:pStyle w:val="ListParagraph"/>
-        <w:numPr>
-          <w:ilvl w:val="0"/>
-          <w:numId w:val="2"/>
-        </w:numPr>
-        <w:bidi w:val="false"/>
-        <w:spacing w:after="40" w:before="40"/>
-        <w:jc w:val="left"/>
-      </w:pPr>
-      <w:r>
-        <w:rPr>
-          <w:rtl w:val="false"/>
-        </w:rPr>
-        <w:t xml:space="preserve">Click Results on the assessment card.</w:t>
-      </w:r>
-    </w:p>
-    <w:p>
-      <w:pPr>
-        <w:pStyle w:val="ListParagraph"/>
-        <w:numPr>
-          <w:ilvl w:val="0"/>
-          <w:numId w:val="2"/>
-        </w:numPr>
-        <w:bidi w:val="false"/>
-        <w:spacing w:after="40" w:before="40"/>
-        <w:jc w:val="left"/>
-      </w:pPr>
-      <w:r>
-        <w:rPr>
-          <w:rtl w:val="false"/>
-        </w:rPr>
-        <w:t xml:space="preserve">The Class analytics panel at the top shows the distribution of scores by band (Low / Medium / High, or A1-C2 for English-style subjects, or PISA Level 1-6 for Math/Science).</w:t>
-      </w:r>
-    </w:p>
-    <w:p>
-      <w:pPr>
-        <w:pStyle w:val="ListParagraph"/>
-        <w:numPr>
-          <w:ilvl w:val="0"/>
-          <w:numId w:val="2"/>
-        </w:numPr>
-        <w:bidi w:val="false"/>
-        <w:spacing w:after="40" w:before="40"/>
-        <w:jc w:val="left"/>
-      </w:pPr>
-      <w:r>
-        <w:rPr>
-          <w:rtl w:val="false"/>
-        </w:rPr>
-        <w:t xml:space="preserve">Below that, each student appears as a row with their score and a Report card button.</w:t>
-      </w:r>
-    </w:p>
-    <w:p>
-      <w:pPr>
-        <w:pStyle w:val="ListParagraph"/>
-        <w:numPr>
-          <w:ilvl w:val="0"/>
-          <w:numId w:val="2"/>
-        </w:numPr>
-        <w:bidi w:val="false"/>
-        <w:spacing w:after="40" w:before="40"/>
-        <w:jc w:val="left"/>
-      </w:pPr>
-      <w:r>
-        <w:rPr>
-          <w:rtl w:val="false"/>
-        </w:rPr>
-        <w:t xml:space="preserve">Click Report card for a single student to see every question, their answer, the correct answer, and Claude's feedback on essays.</w:t>
-      </w:r>
-    </w:p>
-    <w:p>
-      <w:pPr>
-        <w:pStyle w:val="ListParagraph"/>
-        <w:numPr>
-          <w:ilvl w:val="0"/>
-          <w:numId w:val="2"/>
-        </w:numPr>
-        <w:bidi w:val="false"/>
-        <w:spacing w:after="40" w:before="40"/>
-        <w:jc w:val="left"/>
-      </w:pPr>
-      <w:r>
-        <w:rPr>
-          <w:rtl w:val="false"/>
-        </w:rPr>
-        <w:t xml:space="preserve">If a student's essay was auto-graded but you disagree, click Override grade and enter your own mark.</w:t>
+        <w:t xml:space="preserve">Each violation counts as one strike. On the third strike, the assessment is auto-submitted and the student is logged out. Examples of violations:</w:t>
+      </w:r>
+    </w:p>
+    <w:p>
+      <w:pPr>
+        <w:pStyle w:val="ListParagraph"/>
+        <w:numPr>
+          <w:ilvl w:val="0"/>
+          <w:numId w:val="3"/>
+        </w:numPr>
+        <w:bidi w:val="false"/>
+        <w:spacing w:after="40" w:before="40"/>
+        <w:jc w:val="left"/>
+      </w:pPr>
+      <w:r>
+        <w:rPr>
+          <w:rtl w:val="false"/>
+        </w:rPr>
+        <w:t xml:space="preserve">Tab switch / Cmd+Tab / minimise — 1 strike.</w:t>
+      </w:r>
+    </w:p>
+    <w:p>
+      <w:pPr>
+        <w:pStyle w:val="ListParagraph"/>
+        <w:numPr>
+          <w:ilvl w:val="0"/>
+          <w:numId w:val="3"/>
+        </w:numPr>
+        <w:bidi w:val="false"/>
+        <w:spacing w:after="40" w:before="40"/>
+        <w:jc w:val="left"/>
+      </w:pPr>
+      <w:r>
+        <w:rPr>
+          <w:rtl w:val="false"/>
+        </w:rPr>
+        <w:t xml:space="preserve">Window loses focus — 1 strike.</w:t>
+      </w:r>
+    </w:p>
+    <w:p>
+      <w:pPr>
+        <w:pStyle w:val="ListParagraph"/>
+        <w:numPr>
+          <w:ilvl w:val="0"/>
+          <w:numId w:val="3"/>
+        </w:numPr>
+        <w:bidi w:val="false"/>
+        <w:spacing w:after="40" w:before="40"/>
+        <w:jc w:val="left"/>
+      </w:pPr>
+      <w:r>
+        <w:rPr>
+          <w:rtl w:val="false"/>
+        </w:rPr>
+        <w:t xml:space="preserve">Exit full-screen — 1 strike.</w:t>
+      </w:r>
+    </w:p>
+    <w:p>
+      <w:pPr>
+        <w:pStyle w:val="ListParagraph"/>
+        <w:numPr>
+          <w:ilvl w:val="0"/>
+          <w:numId w:val="3"/>
+        </w:numPr>
+        <w:bidi w:val="false"/>
+        <w:spacing w:after="40" w:before="40"/>
+        <w:jc w:val="left"/>
+      </w:pPr>
+      <w:r>
+        <w:rPr>
+          <w:rtl w:val="false"/>
+        </w:rPr>
+        <w:t xml:space="preserve">Press a screenshot shortcut (PrintScreen, Cmd+Shift+S, etc.) — 1 strike.</w:t>
+      </w:r>
+    </w:p>
+    <w:p>
+      <w:pPr>
+        <w:pStyle w:val="ListParagraph"/>
+        <w:numPr>
+          <w:ilvl w:val="0"/>
+          <w:numId w:val="3"/>
+        </w:numPr>
+        <w:bidi w:val="false"/>
+        <w:spacing w:after="40" w:before="40"/>
+        <w:jc w:val="left"/>
+      </w:pPr>
+      <w:r>
+        <w:rPr>
+          <w:rtl w:val="false"/>
+        </w:rPr>
+        <w:t xml:space="preserve">Webcam turned off / covered / muted — 1 strike (online mode only).</w:t>
+      </w:r>
+    </w:p>
+    <w:p>
+      <w:pPr>
+        <w:pStyle w:val="ListParagraph"/>
+        <w:numPr>
+          <w:ilvl w:val="0"/>
+          <w:numId w:val="3"/>
+        </w:numPr>
+        <w:bidi w:val="false"/>
+        <w:spacing w:after="40" w:before="40"/>
+        <w:jc w:val="left"/>
+      </w:pPr>
+      <w:r>
+        <w:rPr>
+          <w:rtl w:val="false"/>
+        </w:rPr>
+        <w:t xml:space="preserve">Different face / no face visible — 1 strike (online mode only).</w:t>
       </w:r>
     </w:p>
     <w:p>
@@ -2506,82 +2337,7 @@
           <w:bCs/>
           <w:color w:val="6D28D9"/>
         </w:rPr>
-        <w:t xml:space="preserve">Exporting</w:t>
-      </w:r>
-    </w:p>
-    <w:p>
-      <w:pPr>
-        <w:pStyle w:val="ListParagraph"/>
-        <w:numPr>
-          <w:ilvl w:val="0"/>
-          <w:numId w:val="3"/>
-        </w:numPr>
-        <w:bidi w:val="false"/>
-        <w:spacing w:after="40" w:before="40"/>
-        <w:jc w:val="left"/>
-      </w:pPr>
-      <w:r>
-        <w:rPr>
-          <w:rtl w:val="false"/>
-        </w:rPr>
-        <w:t xml:space="preserve">Click 📊 Excel scoresheet to download all results as a spreadsheet.</w:t>
-      </w:r>
-    </w:p>
-    <w:p>
-      <w:pPr>
-        <w:pStyle w:val="ListParagraph"/>
-        <w:numPr>
-          <w:ilvl w:val="0"/>
-          <w:numId w:val="3"/>
-        </w:numPr>
-        <w:bidi w:val="false"/>
-        <w:spacing w:after="40" w:before="40"/>
-        <w:jc w:val="left"/>
-      </w:pPr>
-      <w:r>
-        <w:rPr>
-          <w:rtl w:val="false"/>
-        </w:rPr>
-        <w:t xml:space="preserve">Click 📄 PDF to download the empty assessment as a printable PDF.</w:t>
-      </w:r>
-    </w:p>
-    <w:p>
-      <w:pPr>
-        <w:pStyle w:val="ListParagraph"/>
-        <w:numPr>
-          <w:ilvl w:val="0"/>
-          <w:numId w:val="3"/>
-        </w:numPr>
-        <w:bidi w:val="false"/>
-        <w:spacing w:after="40" w:before="40"/>
-        <w:jc w:val="left"/>
-      </w:pPr>
-      <w:r>
-        <w:rPr>
-          <w:rtl w:val="false"/>
-        </w:rPr>
-        <w:t xml:space="preserve">Click Word doc to download the assessment in editable .docx format.</w:t>
-      </w:r>
-    </w:p>
-    <w:p>
-      <w:pPr>
-        <w:spacing w:after="100" w:before="100"/>
-      </w:pPr>
-      <w:r>
-        <w:t xml:space="preserve"/>
-      </w:r>
-    </w:p>
-    <w:p>
-      <w:pPr>
-        <w:pStyle w:val="Heading1"/>
-      </w:pPr>
-      <w:r>
-        <w:rPr>
-          <w:b/>
-          <w:bCs/>
-          <w:color w:val="1A1E33"/>
-        </w:rPr>
-        <w:t xml:space="preserve">13. When a student gets locked out</w:t>
+        <w:t xml:space="preserve">Webcam proctoring (online mode only)</w:t>
       </w:r>
     </w:p>
     <w:p>
@@ -2595,114 +2351,7 @@
           <w:rFonts w:ascii="Arial" w:cs="Arial" w:eastAsia="Arial" w:hAnsi="Arial"/>
           <w:rtl w:val="false"/>
         </w:rPr>
-        <w:t xml:space="preserve">If a student violates the 3-strike rule or loses connection, you can grant a one-time re-entry so they can complete the assessment.</w:t>
-      </w:r>
-    </w:p>
-    <w:p>
-      <w:pPr>
-        <w:pStyle w:val="ListParagraph"/>
-        <w:numPr>
-          <w:ilvl w:val="0"/>
-          <w:numId w:val="2"/>
-        </w:numPr>
-        <w:bidi w:val="false"/>
-        <w:spacing w:after="40" w:before="40"/>
-        <w:jc w:val="left"/>
-      </w:pPr>
-      <w:r>
-        <w:rPr>
-          <w:rtl w:val="false"/>
-        </w:rPr>
-        <w:t xml:space="preserve">Open Results for the assessment.</w:t>
-      </w:r>
-    </w:p>
-    <w:p>
-      <w:pPr>
-        <w:pStyle w:val="ListParagraph"/>
-        <w:numPr>
-          <w:ilvl w:val="0"/>
-          <w:numId w:val="2"/>
-        </w:numPr>
-        <w:bidi w:val="false"/>
-        <w:spacing w:after="40" w:before="40"/>
-        <w:jc w:val="left"/>
-      </w:pPr>
-      <w:r>
-        <w:rPr>
-          <w:rtl w:val="false"/>
-        </w:rPr>
-        <w:t xml:space="preserve">Find the student in the list. If they appear with a "Locked out" badge, click Grant re-entry next to their name.</w:t>
-      </w:r>
-    </w:p>
-    <w:p>
-      <w:pPr>
-        <w:pStyle w:val="ListParagraph"/>
-        <w:numPr>
-          <w:ilvl w:val="0"/>
-          <w:numId w:val="2"/>
-        </w:numPr>
-        <w:bidi w:val="false"/>
-        <w:spacing w:after="40" w:before="40"/>
-        <w:jc w:val="left"/>
-      </w:pPr>
-      <w:r>
-        <w:rPr>
-          <w:rtl w:val="false"/>
-        </w:rPr>
-        <w:t xml:space="preserve">If the student does not appear (because they were logged out before submitting anything), use the Grant re-entry by email panel at the bottom of the Results page. Enter their email and click Grant.</w:t>
-      </w:r>
-    </w:p>
-    <w:p>
-      <w:pPr>
-        <w:pStyle w:val="ListParagraph"/>
-        <w:numPr>
-          <w:ilvl w:val="0"/>
-          <w:numId w:val="2"/>
-        </w:numPr>
-        <w:bidi w:val="false"/>
-        <w:spacing w:after="40" w:before="40"/>
-        <w:jc w:val="left"/>
-      </w:pPr>
-      <w:r>
-        <w:rPr>
-          <w:rtl w:val="false"/>
-        </w:rPr>
-        <w:t xml:space="preserve">Tell the student to sign in again and reopen the assessment. They will resume from where they left off, with their previous answers pre-filled.</w:t>
-      </w:r>
-    </w:p>
-    <w:p>
-      <w:pPr>
-        <w:spacing w:after="100" w:before="100"/>
-      </w:pPr>
-      <w:r>
-        <w:t xml:space="preserve"/>
-      </w:r>
-    </w:p>
-    <w:p>
-      <w:pPr>
-        <w:pStyle w:val="Heading1"/>
-      </w:pPr>
-      <w:r>
-        <w:rPr>
-          <w:b/>
-          <w:bCs/>
-          <w:color w:val="1A1E33"/>
-        </w:rPr>
-        <w:t xml:space="preserve">14. Settings and the AI key</w:t>
-      </w:r>
-    </w:p>
-    <w:p>
-      <w:pPr>
-        <w:bidi w:val="false"/>
-        <w:spacing w:after="80" w:before="80"/>
-        <w:jc w:val="left"/>
-      </w:pPr>
-      <w:r>
-        <w:rPr>
-          <w:rFonts w:ascii="Arial" w:cs="Arial" w:eastAsia="Arial" w:hAnsi="Arial"/>
-          <w:rtl w:val="false"/>
-        </w:rPr>
-        <w:t xml:space="preserve">The AI features (generate assessment, generate script, essay auto-grading, identity checks, webcam vision) all need an Anthropic API key. Add one in Settings → API key. The key is stored on the server only, never shared with students, and applies to every assessment in your school.</w:t>
+        <w:t xml:space="preserve">Online assessments require the student to grant webcam access at the start. Identity is checked roughly every 15 seconds. Talking, multiple people in the frame, and phones pointed at the screen are all flagged.</w:t>
       </w:r>
     </w:p>
     <w:p>
@@ -2727,6 +2376,471 @@
         <w:rPr>
           <w:rtl w:val="false"/>
         </w:rPr>
+        <w:t xml:space="preserve">To completely block screenshots on macOS, students must take the assessment in the ClassCurio desktop app. The browser cannot fully block macOS's system screenshot keys.</w:t>
+      </w:r>
+    </w:p>
+    <w:p>
+      <w:pPr>
+        <w:spacing w:after="100" w:before="100"/>
+      </w:pPr>
+      <w:r>
+        <w:t xml:space="preserve"/>
+      </w:r>
+    </w:p>
+    <w:p>
+      <w:pPr>
+        <w:pStyle w:val="Heading1"/>
+      </w:pPr>
+      <w:r>
+        <w:rPr>
+          <w:b/>
+          <w:bCs/>
+          <w:color w:val="1A1E33"/>
+        </w:rPr>
+        <w:t xml:space="preserve">12. Sharing the assessment with students</w:t>
+      </w:r>
+    </w:p>
+    <w:p>
+      <w:pPr>
+        <w:pStyle w:val="ListParagraph"/>
+        <w:numPr>
+          <w:ilvl w:val="0"/>
+          <w:numId w:val="2"/>
+        </w:numPr>
+        <w:bidi w:val="false"/>
+        <w:spacing w:after="40" w:before="40"/>
+        <w:jc w:val="left"/>
+      </w:pPr>
+      <w:r>
+        <w:rPr>
+          <w:rtl w:val="false"/>
+        </w:rPr>
+        <w:t xml:space="preserve">Make sure the assessment is set to Published in the builder.</w:t>
+      </w:r>
+    </w:p>
+    <w:p>
+      <w:pPr>
+        <w:pStyle w:val="ListParagraph"/>
+        <w:numPr>
+          <w:ilvl w:val="0"/>
+          <w:numId w:val="2"/>
+        </w:numPr>
+        <w:bidi w:val="false"/>
+        <w:spacing w:after="40" w:before="40"/>
+        <w:jc w:val="left"/>
+      </w:pPr>
+      <w:r>
+        <w:rPr>
+          <w:rtl w:val="false"/>
+        </w:rPr>
+        <w:t xml:space="preserve">On the dashboard, click 🔗 Share with students on the assessment card.</w:t>
+      </w:r>
+    </w:p>
+    <w:p>
+      <w:pPr>
+        <w:pStyle w:val="ListParagraph"/>
+        <w:numPr>
+          <w:ilvl w:val="0"/>
+          <w:numId w:val="2"/>
+        </w:numPr>
+        <w:bidi w:val="false"/>
+        <w:spacing w:after="40" w:before="40"/>
+        <w:jc w:val="left"/>
+      </w:pPr>
+      <w:r>
+        <w:rPr>
+          <w:rtl w:val="false"/>
+        </w:rPr>
+        <w:t xml:space="preserve">A panel appears with a link. Click Copy, then paste the link in your classroom chat (WhatsApp, Email, Teams, etc.).</w:t>
+      </w:r>
+    </w:p>
+    <w:p>
+      <w:pPr>
+        <w:pStyle w:val="ListParagraph"/>
+        <w:numPr>
+          <w:ilvl w:val="0"/>
+          <w:numId w:val="2"/>
+        </w:numPr>
+        <w:bidi w:val="false"/>
+        <w:spacing w:after="40" w:before="40"/>
+        <w:jc w:val="left"/>
+      </w:pPr>
+      <w:r>
+        <w:rPr>
+          <w:rtl w:val="false"/>
+        </w:rPr>
+        <w:t xml:space="preserve">Students click the link, sign in (or register if first time), and start the assessment.</w:t>
+      </w:r>
+    </w:p>
+    <w:p>
+      <w:pPr>
+        <w:pStyle w:val="Heading3"/>
+      </w:pPr>
+      <w:r>
+        <w:rPr>
+          <w:b/>
+          <w:bCs/>
+          <w:color w:val="6D28D9"/>
+        </w:rPr>
+        <w:t xml:space="preserve">Sharing with another teacher</w:t>
+      </w:r>
+    </w:p>
+    <w:p>
+      <w:pPr>
+        <w:bidi w:val="false"/>
+        <w:spacing w:after="80" w:before="80"/>
+        <w:jc w:val="left"/>
+      </w:pPr>
+      <w:r>
+        <w:rPr>
+          <w:rFonts w:ascii="Arial" w:cs="Arial" w:eastAsia="Arial" w:hAnsi="Arial"/>
+          <w:rtl w:val="false"/>
+        </w:rPr>
+        <w:t xml:space="preserve">Click 🤝 Share with teacher to generate a teacher-only preview link. The receiving teacher can preview, print, or Duplicate into their own class with one click.</w:t>
+      </w:r>
+    </w:p>
+    <w:p>
+      <w:pPr>
+        <w:spacing w:after="100" w:before="100"/>
+      </w:pPr>
+      <w:r>
+        <w:t xml:space="preserve"/>
+      </w:r>
+    </w:p>
+    <w:p>
+      <w:pPr>
+        <w:pStyle w:val="Heading1"/>
+      </w:pPr>
+      <w:r>
+        <w:rPr>
+          <w:b/>
+          <w:bCs/>
+          <w:color w:val="1A1E33"/>
+        </w:rPr>
+        <w:t xml:space="preserve">13. Viewing results and analytics</w:t>
+      </w:r>
+    </w:p>
+    <w:p>
+      <w:pPr>
+        <w:pStyle w:val="ListParagraph"/>
+        <w:numPr>
+          <w:ilvl w:val="0"/>
+          <w:numId w:val="2"/>
+        </w:numPr>
+        <w:bidi w:val="false"/>
+        <w:spacing w:after="40" w:before="40"/>
+        <w:jc w:val="left"/>
+      </w:pPr>
+      <w:r>
+        <w:rPr>
+          <w:rtl w:val="false"/>
+        </w:rPr>
+        <w:t xml:space="preserve">Click Results on the assessment card.</w:t>
+      </w:r>
+    </w:p>
+    <w:p>
+      <w:pPr>
+        <w:pStyle w:val="ListParagraph"/>
+        <w:numPr>
+          <w:ilvl w:val="0"/>
+          <w:numId w:val="2"/>
+        </w:numPr>
+        <w:bidi w:val="false"/>
+        <w:spacing w:after="40" w:before="40"/>
+        <w:jc w:val="left"/>
+      </w:pPr>
+      <w:r>
+        <w:rPr>
+          <w:rtl w:val="false"/>
+        </w:rPr>
+        <w:t xml:space="preserve">The Class analytics panel at the top shows the distribution of scores by band (Low / Medium / High, or A1-C2 for English-style subjects, or PISA Level 1-6 for Math/Science).</w:t>
+      </w:r>
+    </w:p>
+    <w:p>
+      <w:pPr>
+        <w:pStyle w:val="ListParagraph"/>
+        <w:numPr>
+          <w:ilvl w:val="0"/>
+          <w:numId w:val="2"/>
+        </w:numPr>
+        <w:bidi w:val="false"/>
+        <w:spacing w:after="40" w:before="40"/>
+        <w:jc w:val="left"/>
+      </w:pPr>
+      <w:r>
+        <w:rPr>
+          <w:rtl w:val="false"/>
+        </w:rPr>
+        <w:t xml:space="preserve">Below that, each student appears as a row with their score and a Report card button.</w:t>
+      </w:r>
+    </w:p>
+    <w:p>
+      <w:pPr>
+        <w:pStyle w:val="ListParagraph"/>
+        <w:numPr>
+          <w:ilvl w:val="0"/>
+          <w:numId w:val="2"/>
+        </w:numPr>
+        <w:bidi w:val="false"/>
+        <w:spacing w:after="40" w:before="40"/>
+        <w:jc w:val="left"/>
+      </w:pPr>
+      <w:r>
+        <w:rPr>
+          <w:rtl w:val="false"/>
+        </w:rPr>
+        <w:t xml:space="preserve">Click Report card for a single student to see every question, their answer, the correct answer, and Claude's feedback on essays.</w:t>
+      </w:r>
+    </w:p>
+    <w:p>
+      <w:pPr>
+        <w:pStyle w:val="ListParagraph"/>
+        <w:numPr>
+          <w:ilvl w:val="0"/>
+          <w:numId w:val="2"/>
+        </w:numPr>
+        <w:bidi w:val="false"/>
+        <w:spacing w:after="40" w:before="40"/>
+        <w:jc w:val="left"/>
+      </w:pPr>
+      <w:r>
+        <w:rPr>
+          <w:rtl w:val="false"/>
+        </w:rPr>
+        <w:t xml:space="preserve">If a student's essay was auto-graded but you disagree, click Override grade and enter your own mark.</w:t>
+      </w:r>
+    </w:p>
+    <w:p>
+      <w:pPr>
+        <w:pStyle w:val="Heading3"/>
+      </w:pPr>
+      <w:r>
+        <w:rPr>
+          <w:b/>
+          <w:bCs/>
+          <w:color w:val="6D28D9"/>
+        </w:rPr>
+        <w:t xml:space="preserve">Exporting</w:t>
+      </w:r>
+    </w:p>
+    <w:p>
+      <w:pPr>
+        <w:pStyle w:val="ListParagraph"/>
+        <w:numPr>
+          <w:ilvl w:val="0"/>
+          <w:numId w:val="3"/>
+        </w:numPr>
+        <w:bidi w:val="false"/>
+        <w:spacing w:after="40" w:before="40"/>
+        <w:jc w:val="left"/>
+      </w:pPr>
+      <w:r>
+        <w:rPr>
+          <w:rtl w:val="false"/>
+        </w:rPr>
+        <w:t xml:space="preserve">Click 📊 Excel scoresheet to download all results as a spreadsheet.</w:t>
+      </w:r>
+    </w:p>
+    <w:p>
+      <w:pPr>
+        <w:pStyle w:val="ListParagraph"/>
+        <w:numPr>
+          <w:ilvl w:val="0"/>
+          <w:numId w:val="3"/>
+        </w:numPr>
+        <w:bidi w:val="false"/>
+        <w:spacing w:after="40" w:before="40"/>
+        <w:jc w:val="left"/>
+      </w:pPr>
+      <w:r>
+        <w:rPr>
+          <w:rtl w:val="false"/>
+        </w:rPr>
+        <w:t xml:space="preserve">Click 📄 PDF to download the empty assessment as a printable PDF.</w:t>
+      </w:r>
+    </w:p>
+    <w:p>
+      <w:pPr>
+        <w:pStyle w:val="ListParagraph"/>
+        <w:numPr>
+          <w:ilvl w:val="0"/>
+          <w:numId w:val="3"/>
+        </w:numPr>
+        <w:bidi w:val="false"/>
+        <w:spacing w:after="40" w:before="40"/>
+        <w:jc w:val="left"/>
+      </w:pPr>
+      <w:r>
+        <w:rPr>
+          <w:rtl w:val="false"/>
+        </w:rPr>
+        <w:t xml:space="preserve">Click Word doc to download the assessment in editable .docx format.</w:t>
+      </w:r>
+    </w:p>
+    <w:p>
+      <w:pPr>
+        <w:spacing w:after="100" w:before="100"/>
+      </w:pPr>
+      <w:r>
+        <w:t xml:space="preserve"/>
+      </w:r>
+    </w:p>
+    <w:p>
+      <w:pPr>
+        <w:pStyle w:val="Heading1"/>
+      </w:pPr>
+      <w:r>
+        <w:rPr>
+          <w:b/>
+          <w:bCs/>
+          <w:color w:val="1A1E33"/>
+        </w:rPr>
+        <w:t xml:space="preserve">14. When a student gets locked out</w:t>
+      </w:r>
+    </w:p>
+    <w:p>
+      <w:pPr>
+        <w:bidi w:val="false"/>
+        <w:spacing w:after="80" w:before="80"/>
+        <w:jc w:val="left"/>
+      </w:pPr>
+      <w:r>
+        <w:rPr>
+          <w:rFonts w:ascii="Arial" w:cs="Arial" w:eastAsia="Arial" w:hAnsi="Arial"/>
+          <w:rtl w:val="false"/>
+        </w:rPr>
+        <w:t xml:space="preserve">If a student violates the 3-strike rule or loses connection, you can grant a one-time re-entry so they can complete the assessment.</w:t>
+      </w:r>
+    </w:p>
+    <w:p>
+      <w:pPr>
+        <w:pStyle w:val="ListParagraph"/>
+        <w:numPr>
+          <w:ilvl w:val="0"/>
+          <w:numId w:val="2"/>
+        </w:numPr>
+        <w:bidi w:val="false"/>
+        <w:spacing w:after="40" w:before="40"/>
+        <w:jc w:val="left"/>
+      </w:pPr>
+      <w:r>
+        <w:rPr>
+          <w:rtl w:val="false"/>
+        </w:rPr>
+        <w:t xml:space="preserve">Open Results for the assessment.</w:t>
+      </w:r>
+    </w:p>
+    <w:p>
+      <w:pPr>
+        <w:pStyle w:val="ListParagraph"/>
+        <w:numPr>
+          <w:ilvl w:val="0"/>
+          <w:numId w:val="2"/>
+        </w:numPr>
+        <w:bidi w:val="false"/>
+        <w:spacing w:after="40" w:before="40"/>
+        <w:jc w:val="left"/>
+      </w:pPr>
+      <w:r>
+        <w:rPr>
+          <w:rtl w:val="false"/>
+        </w:rPr>
+        <w:t xml:space="preserve">Find the student in the list. If they appear with a "Locked out" badge, click Grant re-entry next to their name.</w:t>
+      </w:r>
+    </w:p>
+    <w:p>
+      <w:pPr>
+        <w:pStyle w:val="ListParagraph"/>
+        <w:numPr>
+          <w:ilvl w:val="0"/>
+          <w:numId w:val="2"/>
+        </w:numPr>
+        <w:bidi w:val="false"/>
+        <w:spacing w:after="40" w:before="40"/>
+        <w:jc w:val="left"/>
+      </w:pPr>
+      <w:r>
+        <w:rPr>
+          <w:rtl w:val="false"/>
+        </w:rPr>
+        <w:t xml:space="preserve">If the student does not appear (because they were logged out before submitting anything), use the Grant re-entry by email panel at the bottom of the Results page. Enter their email and click Grant.</w:t>
+      </w:r>
+    </w:p>
+    <w:p>
+      <w:pPr>
+        <w:pStyle w:val="ListParagraph"/>
+        <w:numPr>
+          <w:ilvl w:val="0"/>
+          <w:numId w:val="2"/>
+        </w:numPr>
+        <w:bidi w:val="false"/>
+        <w:spacing w:after="40" w:before="40"/>
+        <w:jc w:val="left"/>
+      </w:pPr>
+      <w:r>
+        <w:rPr>
+          <w:rtl w:val="false"/>
+        </w:rPr>
+        <w:t xml:space="preserve">Tell the student to sign in again and reopen the assessment. They will resume from where they left off, with their previous answers pre-filled.</w:t>
+      </w:r>
+    </w:p>
+    <w:p>
+      <w:pPr>
+        <w:spacing w:after="100" w:before="100"/>
+      </w:pPr>
+      <w:r>
+        <w:t xml:space="preserve"/>
+      </w:r>
+    </w:p>
+    <w:p>
+      <w:pPr>
+        <w:pStyle w:val="Heading1"/>
+      </w:pPr>
+      <w:r>
+        <w:rPr>
+          <w:b/>
+          <w:bCs/>
+          <w:color w:val="1A1E33"/>
+        </w:rPr>
+        <w:t xml:space="preserve">15. Settings and the AI key</w:t>
+      </w:r>
+    </w:p>
+    <w:p>
+      <w:pPr>
+        <w:bidi w:val="false"/>
+        <w:spacing w:after="80" w:before="80"/>
+        <w:jc w:val="left"/>
+      </w:pPr>
+      <w:r>
+        <w:rPr>
+          <w:rFonts w:ascii="Arial" w:cs="Arial" w:eastAsia="Arial" w:hAnsi="Arial"/>
+          <w:rtl w:val="false"/>
+        </w:rPr>
+        <w:t xml:space="preserve">The AI features (generate assessment, generate script, essay auto-grading, identity checks, webcam vision) all need an Anthropic API key. Add one in Settings → API key. The key is stored on the server only, never shared with students, and applies to every assessment in your school.</w:t>
+      </w:r>
+    </w:p>
+    <w:p>
+      <w:pPr>
+        <w:pBdr>
+          <w:left w:val="single" w:color="F59E0B" w:sz="18"/>
+        </w:pBdr>
+        <w:shd w:fill="FEF7E6" w:val="clear"/>
+        <w:bidi w:val="false"/>
+        <w:spacing w:after="100" w:before="100"/>
+        <w:jc w:val="left"/>
+      </w:pPr>
+      <w:r>
+        <w:rPr>
+          <w:b/>
+          <w:bCs/>
+          <w:rtl w:val="false"/>
+        </w:rPr>
+        <w:t xml:space="preserve">💡 Tip: </w:t>
+      </w:r>
+      <w:r>
+        <w:rPr>
+          <w:rtl w:val="false"/>
+        </w:rPr>
         <w:t xml:space="preserve">If AI generation says "No Anthropic API key configured," that is the place to fix it.</w:t>
       </w:r>
     </w:p>
@@ -2748,7 +2862,7 @@
           <w:bCs/>
           <w:color w:val="1A1E33"/>
         </w:rPr>
-        <w:t xml:space="preserve">15. Tips for first-time deployment</w:t>
+        <w:t xml:space="preserve">16. Tips for first-time deployment</w:t>
       </w:r>
     </w:p>
     <w:p>
@@ -4108,7 +4222,7 @@
           <w:bCs/>
           <w:color w:val="1A1E33"/>
         </w:rPr>
-        <w:t xml:space="preserve">٧. إنشاء تقييم — يدوياً</w:t>
+        <w:t xml:space="preserve">٧. معاينة التقييم (جديد)</w:t>
       </w:r>
     </w:p>
     <w:p>
@@ -4122,20 +4236,7 @@
           <w:rFonts w:ascii="Arial" w:cs="Arial" w:eastAsia="Arial" w:hAnsi="Arial"/>
           <w:rtl/>
         </w:rPr>
-        <w:t xml:space="preserve">انقر على + تقييم جديد ثم ابدأ من الصفر. املأ أداة الإنشاء.</w:t>
-      </w:r>
-    </w:p>
-    <w:p>
-      <w:pPr>
-        <w:pStyle w:val="Heading3"/>
-      </w:pPr>
-      <w:r>
-        <w:rPr>
-          <w:b/>
-          <w:bCs/>
-          <w:color w:val="6D28D9"/>
-        </w:rPr>
-        <w:t xml:space="preserve">الإعدادات الأساسية</w:t>
+        <w:t xml:space="preserve">بعد حفظ تقييم (أو نسخه)، انقر على 👁 معاينة على بطاقة التقييم لفتح عرض للقراءة فقط في علامة تبويب جديدة. سترى كل قسم وفقرة وسؤال وصوت استماع وزوج توفيق بالضبط كما يراه الطالب.</w:t>
       </w:r>
     </w:p>
     <w:p>
@@ -4153,7 +4254,7 @@
         <w:rPr>
           <w:rtl/>
         </w:rPr>
-        <w:t xml:space="preserve">العنوان — ما يراه الطلاب في أعلى التقييم.</w:t>
+        <w:t xml:space="preserve">قم بتفعيل "إظهار مفاتيح الإجابة" في الأعلى للتحقق من الإجابات الصحيحة.</w:t>
       </w:r>
     </w:p>
     <w:p>
@@ -4171,7 +4272,7 @@
         <w:rPr>
           <w:rtl/>
         </w:rPr>
-        <w:t xml:space="preserve">الفصل — الفصل الذي يمكنه إجراء هذا التقييم.</w:t>
+        <w:t xml:space="preserve">لا يعمل القفل في وضع المعاينة — يمكنك التنقل بحرية.</w:t>
       </w:r>
     </w:p>
     <w:p>
@@ -4189,214 +4290,7 @@
         <w:rPr>
           <w:rtl/>
         </w:rPr>
-        <w:t xml:space="preserve">المادة — اختر من القائمة المنسدلة. الاستماع و IELTS و TOEFL و PISA تفعّل سلوك الصوت الخاص (انظر القسم 9).</w:t>
-      </w:r>
-    </w:p>
-    <w:p>
-      <w:pPr>
-        <w:pStyle w:val="ListParagraph"/>
-        <w:numPr>
-          <w:ilvl w:val="0"/>
-          <w:numId w:val="5"/>
-        </w:numPr>
-        <w:bidi/>
-        <w:spacing w:after="40" w:before="40"/>
-        <w:jc w:val="right"/>
-      </w:pPr>
-      <w:r>
-        <w:rPr>
-          <w:rtl/>
-        </w:rPr>
-        <w:t xml:space="preserve">لغة التقييم — تخبر الذكاء الاصطناعي بأي لغة يجب التصحيح والأصوات المقترحة للاستماع.</w:t>
-      </w:r>
-    </w:p>
-    <w:p>
-      <w:pPr>
-        <w:pStyle w:val="ListParagraph"/>
-        <w:numPr>
-          <w:ilvl w:val="0"/>
-          <w:numId w:val="5"/>
-        </w:numPr>
-        <w:bidi/>
-        <w:spacing w:after="40" w:before="40"/>
-        <w:jc w:val="right"/>
-      </w:pPr>
-      <w:r>
-        <w:rPr>
-          <w:rtl/>
-        </w:rPr>
-        <w:t xml:space="preserve">المرحلة الدراسية، السنة الأكاديمية، الفصل الدراسي، تاريخ الجدولة.</w:t>
-      </w:r>
-    </w:p>
-    <w:p>
-      <w:pPr>
-        <w:pStyle w:val="ListParagraph"/>
-        <w:numPr>
-          <w:ilvl w:val="0"/>
-          <w:numId w:val="5"/>
-        </w:numPr>
-        <w:bidi/>
-        <w:spacing w:after="40" w:before="40"/>
-        <w:jc w:val="right"/>
-      </w:pPr>
-      <w:r>
-        <w:rPr>
-          <w:rtl/>
-        </w:rPr>
-        <w:t xml:space="preserve">المدة بالدقائق — المؤقت الذي يراه الطالب.</w:t>
-      </w:r>
-    </w:p>
-    <w:p>
-      <w:pPr>
-        <w:pStyle w:val="ListParagraph"/>
-        <w:numPr>
-          <w:ilvl w:val="0"/>
-          <w:numId w:val="5"/>
-        </w:numPr>
-        <w:bidi/>
-        <w:spacing w:after="40" w:before="40"/>
-        <w:jc w:val="right"/>
-      </w:pPr>
-      <w:r>
-        <w:rPr>
-          <w:rtl/>
-        </w:rPr>
-        <w:t xml:space="preserve">طريقة التسليم — عبر الإنترنت (كاميرا الويب إلزامية) أو في الموقع (تشرف شخصياً، لا تُطلب الكاميرا).</w:t>
-      </w:r>
-    </w:p>
-    <w:p>
-      <w:pPr>
-        <w:pStyle w:val="ListParagraph"/>
-        <w:numPr>
-          <w:ilvl w:val="0"/>
-          <w:numId w:val="5"/>
-        </w:numPr>
-        <w:bidi/>
-        <w:spacing w:after="40" w:before="40"/>
-        <w:jc w:val="right"/>
-      </w:pPr>
-      <w:r>
-        <w:rPr>
-          <w:rtl/>
-        </w:rPr>
-        <w:t xml:space="preserve">منشور / مسودة — فقط التقييمات المنشورة مرئية للطلاب.</w:t>
-      </w:r>
-    </w:p>
-    <w:p>
-      <w:pPr>
-        <w:pStyle w:val="Heading3"/>
-      </w:pPr>
-      <w:r>
-        <w:rPr>
-          <w:b/>
-          <w:bCs/>
-          <w:color w:val="6D28D9"/>
-        </w:rPr>
-        <w:t xml:space="preserve">إضافة أقسام وأسئلة</w:t>
-      </w:r>
-    </w:p>
-    <w:p>
-      <w:pPr>
-        <w:bidi/>
-        <w:spacing w:after="80" w:before="80"/>
-        <w:jc w:val="right"/>
-      </w:pPr>
-      <w:r>
-        <w:rPr>
-          <w:rFonts w:ascii="Arial" w:cs="Arial" w:eastAsia="Arial" w:hAnsi="Arial"/>
-          <w:rtl/>
-        </w:rPr>
-        <w:t xml:space="preserve">معظم التقييمات تحتوي على قسم واحد، ولكن يمكنك إضافة المزيد لاختبارات فهم القراءة أو متعددة الأجزاء.</w:t>
-      </w:r>
-    </w:p>
-    <w:p>
-      <w:pPr>
-        <w:pStyle w:val="ListParagraph"/>
-        <w:numPr>
-          <w:ilvl w:val="0"/>
-          <w:numId w:val="4"/>
-        </w:numPr>
-        <w:bidi/>
-        <w:spacing w:after="40" w:before="40"/>
-        <w:jc w:val="right"/>
-      </w:pPr>
-      <w:r>
-        <w:rPr>
-          <w:rtl/>
-        </w:rPr>
-        <w:t xml:space="preserve">انقر على + قسم لإضافة قسم. أعطه عنواناً (مثل "القسم أ — القراءة") وتعليمات يراها الطلاب.</w:t>
-      </w:r>
-    </w:p>
-    <w:p>
-      <w:pPr>
-        <w:pStyle w:val="ListParagraph"/>
-        <w:numPr>
-          <w:ilvl w:val="0"/>
-          <w:numId w:val="4"/>
-        </w:numPr>
-        <w:bidi/>
-        <w:spacing w:after="40" w:before="40"/>
-        <w:jc w:val="right"/>
-      </w:pPr>
-      <w:r>
-        <w:rPr>
-          <w:rtl/>
-        </w:rPr>
-        <w:t xml:space="preserve">إذا كان للقسم فقرة قراءة، الصقها في صندوق فقرة القراءة / النص المصدر. سيرى الطالب الفقرة فوق أسئلة هذا القسم.</w:t>
-      </w:r>
-    </w:p>
-    <w:p>
-      <w:pPr>
-        <w:pStyle w:val="ListParagraph"/>
-        <w:numPr>
-          <w:ilvl w:val="0"/>
-          <w:numId w:val="4"/>
-        </w:numPr>
-        <w:bidi/>
-        <w:spacing w:after="40" w:before="40"/>
-        <w:jc w:val="right"/>
-      </w:pPr>
-      <w:r>
-        <w:rPr>
-          <w:rtl/>
-        </w:rPr>
-        <w:t xml:space="preserve">انقر على أي زر من أزرار أنواع الأسئلة لإضافة سؤال: + اختيار متعدد، + صح/خطأ، + صح/خطأ/غير مذكور، + إجابة قصيرة، + إجابة طويلة، + مقال (تصحيح يدوي)، + مقال (تصحيح آلي).</w:t>
-      </w:r>
-    </w:p>
-    <w:p>
-      <w:pPr>
-        <w:pStyle w:val="ListParagraph"/>
-        <w:numPr>
-          <w:ilvl w:val="0"/>
-          <w:numId w:val="4"/>
-        </w:numPr>
-        <w:bidi/>
-        <w:spacing w:after="40" w:before="40"/>
-        <w:jc w:val="right"/>
-      </w:pPr>
-      <w:r>
-        <w:rPr>
-          <w:rtl/>
-        </w:rPr>
-        <w:t xml:space="preserve">املأ النص والخيارات والإجابة الصحيحة لكل سؤال.</w:t>
-      </w:r>
-    </w:p>
-    <w:p>
-      <w:pPr>
-        <w:pStyle w:val="ListParagraph"/>
-        <w:numPr>
-          <w:ilvl w:val="0"/>
-          <w:numId w:val="4"/>
-        </w:numPr>
-        <w:bidi/>
-        <w:spacing w:after="40" w:before="40"/>
-        <w:jc w:val="right"/>
-      </w:pPr>
-      <w:r>
-        <w:rPr>
-          <w:rtl/>
-        </w:rPr>
-        <w:t xml:space="preserve">عند الانتهاء، انقر على حفظ. تغلق أداة الإنشاء وتعود إلى لوحة المعلومات.</w:t>
+        <w:t xml:space="preserve">انقر على ✎ تعديل هذا التقييم في الشريط العلوي للمعاينة للعودة إلى أداة الإنشاء إذا لاحظت شيئاً يحتاج إلى إصلاح.</w:t>
       </w:r>
     </w:p>
     <w:p>
@@ -4421,7 +4315,7 @@
         <w:rPr>
           <w:rtl/>
         </w:rPr>
-        <w:t xml:space="preserve">المقال (تصحيح آلي) يستخدم Claude مع معيار التقييم الذي اخترته. اختر المرحلة 7 أو 8 لمعايير IB، أو 3-5 / 5-9 للابتدائي/المتوسط.</w:t>
+        <w:t xml:space="preserve">قم بمعاينة كل تقييم جديد مرة واحدة قبل مشاركة الرابط مع الطلاب. أسرع طريقة لاكتشاف الأخطاء الإملائية أو الخيارات المفقودة أو الأزواج التي نسيت ملأها.</w:t>
       </w:r>
     </w:p>
     <w:p>
@@ -4442,7 +4336,7 @@
           <w:bCs/>
           <w:color w:val="1A1E33"/>
         </w:rPr>
-        <w:t xml:space="preserve">٨. فهم القراءة — الفقرات مع أداة تظليل</w:t>
+        <w:t xml:space="preserve">٨. إنشاء تقييم — يدوياً</w:t>
       </w:r>
     </w:p>
     <w:p>
@@ -4456,7 +4350,20 @@
           <w:rFonts w:ascii="Arial" w:cs="Arial" w:eastAsia="Arial" w:hAnsi="Arial"/>
           <w:rtl/>
         </w:rPr>
-        <w:t xml:space="preserve">عندما يحتوي قسم على فقرة قراءة، يرى الطالب الفقرة فوق الأسئلة أثناء الامتحان. يظهر شريط أداة تظليل أصفر عمودي على الجانب الأيسر من الشاشة.</w:t>
+        <w:t xml:space="preserve">انقر على + تقييم جديد ثم ابدأ من الصفر. املأ أداة الإنشاء.</w:t>
+      </w:r>
+    </w:p>
+    <w:p>
+      <w:pPr>
+        <w:pStyle w:val="Heading3"/>
+      </w:pPr>
+      <w:r>
+        <w:rPr>
+          <w:b/>
+          <w:bCs/>
+          <w:color w:val="6D28D9"/>
+        </w:rPr>
+        <w:t xml:space="preserve">الإعدادات الأساسية</w:t>
       </w:r>
     </w:p>
     <w:p>
@@ -4474,7 +4381,7 @@
         <w:rPr>
           <w:rtl/>
         </w:rPr>
-        <w:t xml:space="preserve">يمكن للطالب تحديد الجمل في الفقرة بالفأرة أو الإصبع.</w:t>
+        <w:t xml:space="preserve">العنوان — ما يراه الطلاب في أعلى التقييم.</w:t>
       </w:r>
     </w:p>
     <w:p>
@@ -4492,7 +4399,7 @@
         <w:rPr>
           <w:rtl/>
         </w:rPr>
-        <w:t xml:space="preserve">النقر على تظليل يلف النص المحدد باللون الأصفر.</w:t>
+        <w:t xml:space="preserve">الفصل — الفصل الذي يمكنه إجراء هذا التقييم.</w:t>
       </w:r>
     </w:p>
     <w:p>
@@ -4510,7 +4417,7 @@
         <w:rPr>
           <w:rtl/>
         </w:rPr>
-        <w:t xml:space="preserve">النقر على ممحاة ثم على جزء مظلل يزيل ذلك التظليل.</w:t>
+        <w:t xml:space="preserve">المادة — اختر من القائمة المنسدلة. الاستماع و IELTS و TOEFL و PISA تفعّل سلوك الصوت الخاص (انظر القسم 9).</w:t>
       </w:r>
     </w:p>
     <w:p>
@@ -4528,7 +4435,7 @@
         <w:rPr>
           <w:rtl/>
         </w:rPr>
-        <w:t xml:space="preserve">النقر على مسح الكل يزيل جميع التظليلات.</w:t>
+        <w:t xml:space="preserve">لغة التقييم — تخبر الذكاء الاصطناعي بأي لغة يجب التصحيح والأصوات المقترحة للاستماع.</w:t>
       </w:r>
     </w:p>
     <w:p>
@@ -4546,7 +4453,74 @@
         <w:rPr>
           <w:rtl/>
         </w:rPr>
-        <w:t xml:space="preserve">تستمر التظليلات إذا فقد الطالب التركيز لفترة وجيزة أو احتاج إلى الاستمرار بعد إعادة الدخول.</w:t>
+        <w:t xml:space="preserve">المرحلة الدراسية، السنة الأكاديمية، الفصل الدراسي، تاريخ الجدولة.</w:t>
+      </w:r>
+    </w:p>
+    <w:p>
+      <w:pPr>
+        <w:pStyle w:val="ListParagraph"/>
+        <w:numPr>
+          <w:ilvl w:val="0"/>
+          <w:numId w:val="5"/>
+        </w:numPr>
+        <w:bidi/>
+        <w:spacing w:after="40" w:before="40"/>
+        <w:jc w:val="right"/>
+      </w:pPr>
+      <w:r>
+        <w:rPr>
+          <w:rtl/>
+        </w:rPr>
+        <w:t xml:space="preserve">المدة بالدقائق — المؤقت الذي يراه الطالب.</w:t>
+      </w:r>
+    </w:p>
+    <w:p>
+      <w:pPr>
+        <w:pStyle w:val="ListParagraph"/>
+        <w:numPr>
+          <w:ilvl w:val="0"/>
+          <w:numId w:val="5"/>
+        </w:numPr>
+        <w:bidi/>
+        <w:spacing w:after="40" w:before="40"/>
+        <w:jc w:val="right"/>
+      </w:pPr>
+      <w:r>
+        <w:rPr>
+          <w:rtl/>
+        </w:rPr>
+        <w:t xml:space="preserve">طريقة التسليم — عبر الإنترنت (كاميرا الويب إلزامية) أو في الموقع (تشرف شخصياً، لا تُطلب الكاميرا).</w:t>
+      </w:r>
+    </w:p>
+    <w:p>
+      <w:pPr>
+        <w:pStyle w:val="ListParagraph"/>
+        <w:numPr>
+          <w:ilvl w:val="0"/>
+          <w:numId w:val="5"/>
+        </w:numPr>
+        <w:bidi/>
+        <w:spacing w:after="40" w:before="40"/>
+        <w:jc w:val="right"/>
+      </w:pPr>
+      <w:r>
+        <w:rPr>
+          <w:rtl/>
+        </w:rPr>
+        <w:t xml:space="preserve">منشور / مسودة — فقط التقييمات المنشورة مرئية للطلاب.</w:t>
+      </w:r>
+    </w:p>
+    <w:p>
+      <w:pPr>
+        <w:pStyle w:val="Heading3"/>
+      </w:pPr>
+      <w:r>
+        <w:rPr>
+          <w:b/>
+          <w:bCs/>
+          <w:color w:val="6D28D9"/>
+        </w:rPr>
+        <w:t xml:space="preserve">إضافة أقسام وأسئلة</w:t>
       </w:r>
     </w:p>
     <w:p>
@@ -4560,104 +4534,7 @@
           <w:rFonts w:ascii="Arial" w:cs="Arial" w:eastAsia="Arial" w:hAnsi="Arial"/>
           <w:rtl/>
         </w:rPr>
-        <w:t xml:space="preserve">لا حاجة لأي إعداد من جانبك — تظهر أداة التظليل تلقائياً عندما يحتوي قسم على فقرة.</w:t>
-      </w:r>
-    </w:p>
-    <w:p>
-      <w:pPr>
-        <w:spacing w:after="100" w:before="100"/>
-      </w:pPr>
-      <w:r>
-        <w:t xml:space="preserve"/>
-      </w:r>
-    </w:p>
-    <w:p>
-      <w:pPr>
-        <w:pStyle w:val="Heading1"/>
-      </w:pPr>
-      <w:r>
-        <w:rPr>
-          <w:b/>
-          <w:bCs/>
-          <w:color w:val="1A1E33"/>
-        </w:rPr>
-        <w:t xml:space="preserve">٩. تقييمات الاستماع</w:t>
-      </w:r>
-    </w:p>
-    <w:p>
-      <w:pPr>
-        <w:bidi/>
-        <w:spacing w:after="80" w:before="80"/>
-        <w:jc w:val="right"/>
-      </w:pPr>
-      <w:r>
-        <w:rPr>
-          <w:rFonts w:ascii="Arial" w:cs="Arial" w:eastAsia="Arial" w:hAnsi="Arial"/>
-          <w:rtl/>
-        </w:rPr>
-        <w:t xml:space="preserve">تدعم ClassCurio طريقتين لإعطاء الطلاب مصدر صوتي: ارفع تسجيلك الخاص، أو دع المتصفح يقرأ نصاً مُنشأ بالذكاء الاصطناعي بصوت عالٍ. اختر أيهما أسهل.</w:t>
-      </w:r>
-    </w:p>
-    <w:p>
-      <w:pPr>
-        <w:pStyle w:val="Heading3"/>
-      </w:pPr>
-      <w:r>
-        <w:rPr>
-          <w:b/>
-          <w:bCs/>
-          <w:color w:val="6D28D9"/>
-        </w:rPr>
-        <w:t xml:space="preserve">خيارات المادة للاستماع</w:t>
-      </w:r>
-    </w:p>
-    <w:p>
-      <w:pPr>
-        <w:pStyle w:val="ListParagraph"/>
-        <w:numPr>
-          <w:ilvl w:val="0"/>
-          <w:numId w:val="5"/>
-        </w:numPr>
-        <w:bidi/>
-        <w:spacing w:after="40" w:before="40"/>
-        <w:jc w:val="right"/>
-      </w:pPr>
-      <w:r>
-        <w:rPr>
-          <w:rtl/>
-        </w:rPr>
-        <w:t xml:space="preserve">استماع — وضع التدريب. يمكن للطلاب تشغيل الصوت مرتين.</w:t>
-      </w:r>
-    </w:p>
-    <w:p>
-      <w:pPr>
-        <w:pStyle w:val="ListParagraph"/>
-        <w:numPr>
-          <w:ilvl w:val="0"/>
-          <w:numId w:val="5"/>
-        </w:numPr>
-        <w:bidi/>
-        <w:spacing w:after="40" w:before="40"/>
-        <w:jc w:val="right"/>
-      </w:pPr>
-      <w:r>
-        <w:rPr>
-          <w:rtl/>
-        </w:rPr>
-        <w:t xml:space="preserve">IELTS و TOEFL و PISA — وضع الامتحان الرسمي. يمكن للطلاب تشغيل الصوت مرة واحدة فقط، بلا إعادة.</w:t>
-      </w:r>
-    </w:p>
-    <w:p>
-      <w:pPr>
-        <w:pStyle w:val="Heading3"/>
-      </w:pPr>
-      <w:r>
-        <w:rPr>
-          <w:b/>
-          <w:bCs/>
-          <w:color w:val="6D28D9"/>
-        </w:rPr>
-        <w:t xml:space="preserve">الخيار أ — رفع ملف MP3 الخاص بك (أو M4A / WAV / OGG / AAC)</w:t>
+        <w:t xml:space="preserve">معظم التقييمات تحتوي على قسم واحد، ولكن يمكنك إضافة المزيد لاختبارات فهم القراءة أو متعددة الأجزاء.</w:t>
       </w:r>
     </w:p>
     <w:p>
@@ -4675,7 +4552,7 @@
         <w:rPr>
           <w:rtl/>
         </w:rPr>
-        <w:t xml:space="preserve">أنشئ التقييم أو عدّله. احفظه أولاً.</w:t>
+        <w:t xml:space="preserve">انقر على + قسم لإضافة قسم. أعطه عنواناً (مثل "القسم أ — القراءة") وتعليمات يراها الطلاب.</w:t>
       </w:r>
     </w:p>
     <w:p>
@@ -4693,7 +4570,7 @@
         <w:rPr>
           <w:rtl/>
         </w:rPr>
-        <w:t xml:space="preserve">انتقل إلى لوحة 🎧 صوت الاستماع.</w:t>
+        <w:t xml:space="preserve">إذا كان للقسم فقرة قراءة، الصقها في صندوق فقرة القراءة / النص المصدر. سيرى الطالب الفقرة فوق أسئلة هذا القسم.</w:t>
       </w:r>
     </w:p>
     <w:p>
@@ -4711,7 +4588,7 @@
         <w:rPr>
           <w:rtl/>
         </w:rPr>
-        <w:t xml:space="preserve">انقر على اختر ملف، اختر صوتك (بحد أقصى 50 ميجابايت)، وانقر على رفع الصوت.</w:t>
+        <w:t xml:space="preserve">انقر على أي زر من أزرار أنواع الأسئلة لإضافة سؤال: + اختيار متعدد، + صح/خطأ، + صح/خطأ/غير مذكور، + إجابة قصيرة، + إجابة طويلة، + مقال (تصحيح يدوي)، + مقال (تصحيح آلي).</w:t>
       </w:r>
     </w:p>
     <w:p>
@@ -4729,20 +4606,7 @@
         <w:rPr>
           <w:rtl/>
         </w:rPr>
-        <w:t xml:space="preserve">يظهر مشغّل معاينة صغير حتى تتحقق من عمله. احفظ التقييم.</w:t>
-      </w:r>
-    </w:p>
-    <w:p>
-      <w:pPr>
-        <w:pStyle w:val="Heading3"/>
-      </w:pPr>
-      <w:r>
-        <w:rPr>
-          <w:b/>
-          <w:bCs/>
-          <w:color w:val="6D28D9"/>
-        </w:rPr>
-        <w:t xml:space="preserve">الخيار ب — استخدم صوت الذكاء الاصطناعي المجاني (لا حاجة لملف)</w:t>
+        <w:t xml:space="preserve">املأ النص والخيارات والإجابة الصحيحة لكل سؤال.</w:t>
       </w:r>
     </w:p>
     <w:p>
@@ -4760,97 +4624,7 @@
         <w:rPr>
           <w:rtl/>
         </w:rPr>
-        <w:t xml:space="preserve">في لوحة 🎧 صوت الاستماع، انقر على ✨ إنشاء نص بالذكاء الاصطناعي. بعد حوالي 10 ثوانٍ يمتلئ مربع النص بنص يطابق أسئلتك.</w:t>
-      </w:r>
-    </w:p>
-    <w:p>
-      <w:pPr>
-        <w:pStyle w:val="ListParagraph"/>
-        <w:numPr>
-          <w:ilvl w:val="0"/>
-          <w:numId w:val="4"/>
-        </w:numPr>
-        <w:bidi/>
-        <w:spacing w:after="40" w:before="40"/>
-        <w:jc w:val="right"/>
-      </w:pPr>
-      <w:r>
-        <w:rPr>
-          <w:rtl/>
-        </w:rPr>
-        <w:t xml:space="preserve">تكتشف لوحة 🎭 المتحدثين كل تسمية متحدث في النص (المتحدث 1، المتحدث 2، سارة، الدكتور خان، إلخ) وتعرض قائمة منسدلة لصوت كل متحدث. افتراضياً، تُعيَّن أصوات مختلفة تلقائياً.</w:t>
-      </w:r>
-    </w:p>
-    <w:p>
-      <w:pPr>
-        <w:pStyle w:val="ListParagraph"/>
-        <w:numPr>
-          <w:ilvl w:val="0"/>
-          <w:numId w:val="4"/>
-        </w:numPr>
-        <w:bidi/>
-        <w:spacing w:after="40" w:before="40"/>
-        <w:jc w:val="right"/>
-      </w:pPr>
-      <w:r>
-        <w:rPr>
-          <w:rtl/>
-        </w:rPr>
-        <w:t xml:space="preserve">اختر صوتاً لكل متحدث — تعرض القائمة المنسدلة الأصوات الأكثر طبيعية أولاً.</w:t>
-      </w:r>
-    </w:p>
-    <w:p>
-      <w:pPr>
-        <w:pStyle w:val="ListParagraph"/>
-        <w:numPr>
-          <w:ilvl w:val="0"/>
-          <w:numId w:val="4"/>
-        </w:numPr>
-        <w:bidi/>
-        <w:spacing w:after="40" w:before="40"/>
-        <w:jc w:val="right"/>
-      </w:pPr>
-      <w:r>
-        <w:rPr>
-          <w:rtl/>
-        </w:rPr>
-        <w:t xml:space="preserve">اختر صوت السرد الافتراضي لأي فقرات غير معنونة.</w:t>
-      </w:r>
-    </w:p>
-    <w:p>
-      <w:pPr>
-        <w:pStyle w:val="ListParagraph"/>
-        <w:numPr>
-          <w:ilvl w:val="0"/>
-          <w:numId w:val="4"/>
-        </w:numPr>
-        <w:bidi/>
-        <w:spacing w:after="40" w:before="40"/>
-        <w:jc w:val="right"/>
-      </w:pPr>
-      <w:r>
-        <w:rPr>
-          <w:rtl/>
-        </w:rPr>
-        <w:t xml:space="preserve">انقر على 🔊 تجربة التشغيل للمعاينة. يقرأ المتصفح دور كل متحدث بصوته الخاص.</w:t>
-      </w:r>
-    </w:p>
-    <w:p>
-      <w:pPr>
-        <w:pStyle w:val="ListParagraph"/>
-        <w:numPr>
-          <w:ilvl w:val="0"/>
-          <w:numId w:val="4"/>
-        </w:numPr>
-        <w:bidi/>
-        <w:spacing w:after="40" w:before="40"/>
-        <w:jc w:val="right"/>
-      </w:pPr>
-      <w:r>
-        <w:rPr>
-          <w:rtl/>
-        </w:rPr>
-        <w:t xml:space="preserve">انقر على استخدم صوت الذكاء الاصطناعي (أو فقط انقر على حفظ) لحفظ النص وتعيينات الأصوات.</w:t>
+        <w:t xml:space="preserve">عند الانتهاء، انقر على حفظ. تغلق أداة الإنشاء وتعود إلى لوحة المعلومات.</w:t>
       </w:r>
     </w:p>
     <w:p>
@@ -4875,7 +4649,181 @@
         <w:rPr>
           <w:rtl/>
         </w:rPr>
-        <w:t xml:space="preserve">على Mac، حمّل الأصوات المميزة (Premium) من إعدادات النظام ← إمكانية الوصول ← المحتوى المنطوق للحصول على صوت أكثر طبيعية. على Windows، تبدو أصوات Microsoft Natural في متصفح Edge بشرية تقريباً.</w:t>
+        <w:t xml:space="preserve">المقال (تصحيح آلي) يستخدم Claude مع معيار التقييم الذي اخترته. اختر المرحلة 7 أو 8 لمعايير IB، أو 3-5 / 5-9 للابتدائي/المتوسط.</w:t>
+      </w:r>
+    </w:p>
+    <w:p>
+      <w:pPr>
+        <w:spacing w:after="100" w:before="100"/>
+      </w:pPr>
+      <w:r>
+        <w:t xml:space="preserve"/>
+      </w:r>
+    </w:p>
+    <w:p>
+      <w:pPr>
+        <w:pStyle w:val="Heading1"/>
+      </w:pPr>
+      <w:r>
+        <w:rPr>
+          <w:b/>
+          <w:bCs/>
+          <w:color w:val="1A1E33"/>
+        </w:rPr>
+        <w:t xml:space="preserve">٩. فهم القراءة — الفقرات مع أداة تظليل</w:t>
+      </w:r>
+    </w:p>
+    <w:p>
+      <w:pPr>
+        <w:bidi/>
+        <w:spacing w:after="80" w:before="80"/>
+        <w:jc w:val="right"/>
+      </w:pPr>
+      <w:r>
+        <w:rPr>
+          <w:rFonts w:ascii="Arial" w:cs="Arial" w:eastAsia="Arial" w:hAnsi="Arial"/>
+          <w:rtl/>
+        </w:rPr>
+        <w:t xml:space="preserve">عندما يحتوي قسم على فقرة قراءة، يرى الطالب الفقرة فوق الأسئلة أثناء الامتحان. يظهر شريط أداة تظليل أصفر عمودي على الجانب الأيسر من الشاشة.</w:t>
+      </w:r>
+    </w:p>
+    <w:p>
+      <w:pPr>
+        <w:pStyle w:val="ListParagraph"/>
+        <w:numPr>
+          <w:ilvl w:val="0"/>
+          <w:numId w:val="5"/>
+        </w:numPr>
+        <w:bidi/>
+        <w:spacing w:after="40" w:before="40"/>
+        <w:jc w:val="right"/>
+      </w:pPr>
+      <w:r>
+        <w:rPr>
+          <w:rtl/>
+        </w:rPr>
+        <w:t xml:space="preserve">يمكن للطالب تحديد الجمل في الفقرة بالفأرة أو الإصبع.</w:t>
+      </w:r>
+    </w:p>
+    <w:p>
+      <w:pPr>
+        <w:pStyle w:val="ListParagraph"/>
+        <w:numPr>
+          <w:ilvl w:val="0"/>
+          <w:numId w:val="5"/>
+        </w:numPr>
+        <w:bidi/>
+        <w:spacing w:after="40" w:before="40"/>
+        <w:jc w:val="right"/>
+      </w:pPr>
+      <w:r>
+        <w:rPr>
+          <w:rtl/>
+        </w:rPr>
+        <w:t xml:space="preserve">النقر على تظليل يلف النص المحدد باللون الأصفر.</w:t>
+      </w:r>
+    </w:p>
+    <w:p>
+      <w:pPr>
+        <w:pStyle w:val="ListParagraph"/>
+        <w:numPr>
+          <w:ilvl w:val="0"/>
+          <w:numId w:val="5"/>
+        </w:numPr>
+        <w:bidi/>
+        <w:spacing w:after="40" w:before="40"/>
+        <w:jc w:val="right"/>
+      </w:pPr>
+      <w:r>
+        <w:rPr>
+          <w:rtl/>
+        </w:rPr>
+        <w:t xml:space="preserve">النقر على ممحاة ثم على جزء مظلل يزيل ذلك التظليل.</w:t>
+      </w:r>
+    </w:p>
+    <w:p>
+      <w:pPr>
+        <w:pStyle w:val="ListParagraph"/>
+        <w:numPr>
+          <w:ilvl w:val="0"/>
+          <w:numId w:val="5"/>
+        </w:numPr>
+        <w:bidi/>
+        <w:spacing w:after="40" w:before="40"/>
+        <w:jc w:val="right"/>
+      </w:pPr>
+      <w:r>
+        <w:rPr>
+          <w:rtl/>
+        </w:rPr>
+        <w:t xml:space="preserve">النقر على مسح الكل يزيل جميع التظليلات.</w:t>
+      </w:r>
+    </w:p>
+    <w:p>
+      <w:pPr>
+        <w:pStyle w:val="ListParagraph"/>
+        <w:numPr>
+          <w:ilvl w:val="0"/>
+          <w:numId w:val="5"/>
+        </w:numPr>
+        <w:bidi/>
+        <w:spacing w:after="40" w:before="40"/>
+        <w:jc w:val="right"/>
+      </w:pPr>
+      <w:r>
+        <w:rPr>
+          <w:rtl/>
+        </w:rPr>
+        <w:t xml:space="preserve">تستمر التظليلات إذا فقد الطالب التركيز لفترة وجيزة أو احتاج إلى الاستمرار بعد إعادة الدخول.</w:t>
+      </w:r>
+    </w:p>
+    <w:p>
+      <w:pPr>
+        <w:bidi/>
+        <w:spacing w:after="80" w:before="80"/>
+        <w:jc w:val="right"/>
+      </w:pPr>
+      <w:r>
+        <w:rPr>
+          <w:rFonts w:ascii="Arial" w:cs="Arial" w:eastAsia="Arial" w:hAnsi="Arial"/>
+          <w:rtl/>
+        </w:rPr>
+        <w:t xml:space="preserve">لا حاجة لأي إعداد من جانبك — تظهر أداة التظليل تلقائياً عندما يحتوي قسم على فقرة.</w:t>
+      </w:r>
+    </w:p>
+    <w:p>
+      <w:pPr>
+        <w:spacing w:after="100" w:before="100"/>
+      </w:pPr>
+      <w:r>
+        <w:t xml:space="preserve"/>
+      </w:r>
+    </w:p>
+    <w:p>
+      <w:pPr>
+        <w:pStyle w:val="Heading1"/>
+      </w:pPr>
+      <w:r>
+        <w:rPr>
+          <w:b/>
+          <w:bCs/>
+          <w:color w:val="1A1E33"/>
+        </w:rPr>
+        <w:t xml:space="preserve">١٠. تقييمات الاستماع</w:t>
+      </w:r>
+    </w:p>
+    <w:p>
+      <w:pPr>
+        <w:bidi/>
+        <w:spacing w:after="80" w:before="80"/>
+        <w:jc w:val="right"/>
+      </w:pPr>
+      <w:r>
+        <w:rPr>
+          <w:rFonts w:ascii="Arial" w:cs="Arial" w:eastAsia="Arial" w:hAnsi="Arial"/>
+          <w:rtl/>
+        </w:rPr>
+        <w:t xml:space="preserve">تدعم ClassCurio طريقتين لإعطاء الطلاب مصدر صوتي: ارفع تسجيلك الخاص، أو دع المتصفح يقرأ نصاً مُنشأ بالذكاء الاصطناعي بصوت عالٍ. اختر أيهما أسهل.</w:t>
       </w:r>
     </w:p>
     <w:p>
@@ -4888,56 +4836,43 @@
           <w:bCs/>
           <w:color w:val="6D28D9"/>
         </w:rPr>
-        <w:t xml:space="preserve">ما يراه الطالب</w:t>
-      </w:r>
-    </w:p>
-    <w:p>
-      <w:pPr>
-        <w:bidi/>
-        <w:spacing w:after="80" w:before="80"/>
-        <w:jc w:val="right"/>
-      </w:pPr>
-      <w:r>
-        <w:rPr>
-          <w:rFonts w:ascii="Arial" w:cs="Arial" w:eastAsia="Arial" w:hAnsi="Arial"/>
-          <w:rtl/>
-        </w:rPr>
-        <w:t xml:space="preserve">شريط أصفر لصوت الاستماع مثبت في أعلى عرض التقييم، مع زر واحد ▶ تشغيل. بعد انتهاء الصوت، يعرض الشريط عدد التشغيلات المتبقية. يقفل الزر عند الوصول إلى الحد الأقصى. لا يمكن إيقاف الصوت مؤقتاً أو إيقافه في منتصف التشغيل.</w:t>
-      </w:r>
-    </w:p>
-    <w:p>
-      <w:pPr>
-        <w:spacing w:after="100" w:before="100"/>
-      </w:pPr>
-      <w:r>
-        <w:t xml:space="preserve"/>
-      </w:r>
-    </w:p>
-    <w:p>
-      <w:pPr>
-        <w:pStyle w:val="Heading1"/>
-      </w:pPr>
-      <w:r>
-        <w:rPr>
-          <w:b/>
-          <w:bCs/>
-          <w:color w:val="1A1E33"/>
-        </w:rPr>
-        <w:t xml:space="preserve">١٠. قواعد القفل والمخالفات</w:t>
-      </w:r>
-    </w:p>
-    <w:p>
-      <w:pPr>
-        <w:bidi/>
-        <w:spacing w:after="80" w:before="80"/>
-        <w:jc w:val="right"/>
-      </w:pPr>
-      <w:r>
-        <w:rPr>
-          <w:rFonts w:ascii="Arial" w:cs="Arial" w:eastAsia="Arial" w:hAnsi="Arial"/>
-          <w:rtl/>
-        </w:rPr>
-        <w:t xml:space="preserve">كل تقييم محمي بطبقة قفل. لا يمكن للطلاب النسخ أو اللصق أو النقر بزر الفأرة الأيمن أو التقاط لقطات الشاشة (حيث يسمح نظام التشغيل للمتصفحات بحظرها) أو فتح نافذة أخرى أو الخروج من وضع ملء الشاشة.</w:t>
+        <w:t xml:space="preserve">خيارات المادة للاستماع</w:t>
+      </w:r>
+    </w:p>
+    <w:p>
+      <w:pPr>
+        <w:pStyle w:val="ListParagraph"/>
+        <w:numPr>
+          <w:ilvl w:val="0"/>
+          <w:numId w:val="5"/>
+        </w:numPr>
+        <w:bidi/>
+        <w:spacing w:after="40" w:before="40"/>
+        <w:jc w:val="right"/>
+      </w:pPr>
+      <w:r>
+        <w:rPr>
+          <w:rtl/>
+        </w:rPr>
+        <w:t xml:space="preserve">استماع — وضع التدريب. يمكن للطلاب تشغيل الصوت مرتين.</w:t>
+      </w:r>
+    </w:p>
+    <w:p>
+      <w:pPr>
+        <w:pStyle w:val="ListParagraph"/>
+        <w:numPr>
+          <w:ilvl w:val="0"/>
+          <w:numId w:val="5"/>
+        </w:numPr>
+        <w:bidi/>
+        <w:spacing w:after="40" w:before="40"/>
+        <w:jc w:val="right"/>
+      </w:pPr>
+      <w:r>
+        <w:rPr>
+          <w:rtl/>
+        </w:rPr>
+        <w:t xml:space="preserve">IELTS و TOEFL و PISA — وضع الامتحان الرسمي. يمكن للطلاب تشغيل الصوت مرة واحدة فقط، بلا إعادة.</w:t>
       </w:r>
     </w:p>
     <w:p>
@@ -4950,129 +4885,79 @@
           <w:bCs/>
           <w:color w:val="6D28D9"/>
         </w:rPr>
-        <w:t xml:space="preserve">قاعدة المخالفات الثلاث</w:t>
-      </w:r>
-    </w:p>
-    <w:p>
-      <w:pPr>
-        <w:bidi/>
-        <w:spacing w:after="80" w:before="80"/>
-        <w:jc w:val="right"/>
-      </w:pPr>
-      <w:r>
-        <w:rPr>
-          <w:rFonts w:ascii="Arial" w:cs="Arial" w:eastAsia="Arial" w:hAnsi="Arial"/>
-          <w:rtl/>
-        </w:rPr>
-        <w:t xml:space="preserve">كل مخالفة تعتبر إنذاراً واحداً. عند الإنذار الثالث، يُسلَّم التقييم تلقائياً ويُخرج الطالب. أمثلة على المخالفات:</w:t>
-      </w:r>
-    </w:p>
-    <w:p>
-      <w:pPr>
-        <w:pStyle w:val="ListParagraph"/>
-        <w:numPr>
-          <w:ilvl w:val="0"/>
-          <w:numId w:val="5"/>
-        </w:numPr>
-        <w:bidi/>
-        <w:spacing w:after="40" w:before="40"/>
-        <w:jc w:val="right"/>
-      </w:pPr>
-      <w:r>
-        <w:rPr>
-          <w:rtl/>
-        </w:rPr>
-        <w:t xml:space="preserve">تبديل علامة التبويب / Cmd+Tab / تصغير — إنذار واحد.</w:t>
-      </w:r>
-    </w:p>
-    <w:p>
-      <w:pPr>
-        <w:pStyle w:val="ListParagraph"/>
-        <w:numPr>
-          <w:ilvl w:val="0"/>
-          <w:numId w:val="5"/>
-        </w:numPr>
-        <w:bidi/>
-        <w:spacing w:after="40" w:before="40"/>
-        <w:jc w:val="right"/>
-      </w:pPr>
-      <w:r>
-        <w:rPr>
-          <w:rtl/>
-        </w:rPr>
-        <w:t xml:space="preserve">فقدان النافذة للتركيز — إنذار واحد.</w:t>
-      </w:r>
-    </w:p>
-    <w:p>
-      <w:pPr>
-        <w:pStyle w:val="ListParagraph"/>
-        <w:numPr>
-          <w:ilvl w:val="0"/>
-          <w:numId w:val="5"/>
-        </w:numPr>
-        <w:bidi/>
-        <w:spacing w:after="40" w:before="40"/>
-        <w:jc w:val="right"/>
-      </w:pPr>
-      <w:r>
-        <w:rPr>
-          <w:rtl/>
-        </w:rPr>
-        <w:t xml:space="preserve">الخروج من وضع ملء الشاشة — إنذار واحد.</w:t>
-      </w:r>
-    </w:p>
-    <w:p>
-      <w:pPr>
-        <w:pStyle w:val="ListParagraph"/>
-        <w:numPr>
-          <w:ilvl w:val="0"/>
-          <w:numId w:val="5"/>
-        </w:numPr>
-        <w:bidi/>
-        <w:spacing w:after="40" w:before="40"/>
-        <w:jc w:val="right"/>
-      </w:pPr>
-      <w:r>
-        <w:rPr>
-          <w:rtl/>
-        </w:rPr>
-        <w:t xml:space="preserve">الضغط على اختصار لقطة الشاشة (PrintScreen، Cmd+Shift+S، إلخ) — إنذار واحد.</w:t>
-      </w:r>
-    </w:p>
-    <w:p>
-      <w:pPr>
-        <w:pStyle w:val="ListParagraph"/>
-        <w:numPr>
-          <w:ilvl w:val="0"/>
-          <w:numId w:val="5"/>
-        </w:numPr>
-        <w:bidi/>
-        <w:spacing w:after="40" w:before="40"/>
-        <w:jc w:val="right"/>
-      </w:pPr>
-      <w:r>
-        <w:rPr>
-          <w:rtl/>
-        </w:rPr>
-        <w:t xml:space="preserve">إيقاف الكاميرا / تغطيتها / كتم صوتها — إنذار واحد (وضع عبر الإنترنت فقط).</w:t>
-      </w:r>
-    </w:p>
-    <w:p>
-      <w:pPr>
-        <w:pStyle w:val="ListParagraph"/>
-        <w:numPr>
-          <w:ilvl w:val="0"/>
-          <w:numId w:val="5"/>
-        </w:numPr>
-        <w:bidi/>
-        <w:spacing w:after="40" w:before="40"/>
-        <w:jc w:val="right"/>
-      </w:pPr>
-      <w:r>
-        <w:rPr>
-          <w:rtl/>
-        </w:rPr>
-        <w:t xml:space="preserve">وجه مختلف / لا وجه مرئي — إنذار واحد (وضع عبر الإنترنت فقط).</w:t>
+        <w:t xml:space="preserve">الخيار أ — رفع ملف MP3 الخاص بك (أو M4A / WAV / OGG / AAC)</w:t>
+      </w:r>
+    </w:p>
+    <w:p>
+      <w:pPr>
+        <w:pStyle w:val="ListParagraph"/>
+        <w:numPr>
+          <w:ilvl w:val="0"/>
+          <w:numId w:val="4"/>
+        </w:numPr>
+        <w:bidi/>
+        <w:spacing w:after="40" w:before="40"/>
+        <w:jc w:val="right"/>
+      </w:pPr>
+      <w:r>
+        <w:rPr>
+          <w:rtl/>
+        </w:rPr>
+        <w:t xml:space="preserve">أنشئ التقييم أو عدّله. احفظه أولاً.</w:t>
+      </w:r>
+    </w:p>
+    <w:p>
+      <w:pPr>
+        <w:pStyle w:val="ListParagraph"/>
+        <w:numPr>
+          <w:ilvl w:val="0"/>
+          <w:numId w:val="4"/>
+        </w:numPr>
+        <w:bidi/>
+        <w:spacing w:after="40" w:before="40"/>
+        <w:jc w:val="right"/>
+      </w:pPr>
+      <w:r>
+        <w:rPr>
+          <w:rtl/>
+        </w:rPr>
+        <w:t xml:space="preserve">انتقل إلى لوحة 🎧 صوت الاستماع.</w:t>
+      </w:r>
+    </w:p>
+    <w:p>
+      <w:pPr>
+        <w:pStyle w:val="ListParagraph"/>
+        <w:numPr>
+          <w:ilvl w:val="0"/>
+          <w:numId w:val="4"/>
+        </w:numPr>
+        <w:bidi/>
+        <w:spacing w:after="40" w:before="40"/>
+        <w:jc w:val="right"/>
+      </w:pPr>
+      <w:r>
+        <w:rPr>
+          <w:rtl/>
+        </w:rPr>
+        <w:t xml:space="preserve">انقر على اختر ملف، اختر صوتك (بحد أقصى 50 ميجابايت)، وانقر على رفع الصوت.</w:t>
+      </w:r>
+    </w:p>
+    <w:p>
+      <w:pPr>
+        <w:pStyle w:val="ListParagraph"/>
+        <w:numPr>
+          <w:ilvl w:val="0"/>
+          <w:numId w:val="4"/>
+        </w:numPr>
+        <w:bidi/>
+        <w:spacing w:after="40" w:before="40"/>
+        <w:jc w:val="right"/>
+      </w:pPr>
+      <w:r>
+        <w:rPr>
+          <w:rtl/>
+        </w:rPr>
+        <w:t xml:space="preserve">يظهر مشغّل معاينة صغير حتى تتحقق من عمله. احفظ التقييم.</w:t>
       </w:r>
     </w:p>
     <w:p>
@@ -5085,21 +4970,115 @@
           <w:bCs/>
           <w:color w:val="6D28D9"/>
         </w:rPr>
-        <w:t xml:space="preserve">مراقبة الكاميرا (وضع عبر الإنترنت فقط)</w:t>
-      </w:r>
-    </w:p>
-    <w:p>
-      <w:pPr>
-        <w:bidi/>
-        <w:spacing w:after="80" w:before="80"/>
-        <w:jc w:val="right"/>
-      </w:pPr>
-      <w:r>
-        <w:rPr>
-          <w:rFonts w:ascii="Arial" w:cs="Arial" w:eastAsia="Arial" w:hAnsi="Arial"/>
-          <w:rtl/>
-        </w:rPr>
-        <w:t xml:space="preserve">تتطلب التقييمات عبر الإنترنت من الطالب منح الإذن للوصول إلى الكاميرا في البداية. يتم التحقق من الهوية كل 15 ثانية تقريباً. يتم الإبلاغ عن التحدث، ووجود أكثر من شخص في الإطار، وتوجيه الهواتف نحو الشاشة.</w:t>
+        <w:t xml:space="preserve">الخيار ب — استخدم صوت الذكاء الاصطناعي المجاني (لا حاجة لملف)</w:t>
+      </w:r>
+    </w:p>
+    <w:p>
+      <w:pPr>
+        <w:pStyle w:val="ListParagraph"/>
+        <w:numPr>
+          <w:ilvl w:val="0"/>
+          <w:numId w:val="4"/>
+        </w:numPr>
+        <w:bidi/>
+        <w:spacing w:after="40" w:before="40"/>
+        <w:jc w:val="right"/>
+      </w:pPr>
+      <w:r>
+        <w:rPr>
+          <w:rtl/>
+        </w:rPr>
+        <w:t xml:space="preserve">في لوحة 🎧 صوت الاستماع، انقر على ✨ إنشاء نص بالذكاء الاصطناعي. بعد حوالي 10 ثوانٍ يمتلئ مربع النص بنص يطابق أسئلتك.</w:t>
+      </w:r>
+    </w:p>
+    <w:p>
+      <w:pPr>
+        <w:pStyle w:val="ListParagraph"/>
+        <w:numPr>
+          <w:ilvl w:val="0"/>
+          <w:numId w:val="4"/>
+        </w:numPr>
+        <w:bidi/>
+        <w:spacing w:after="40" w:before="40"/>
+        <w:jc w:val="right"/>
+      </w:pPr>
+      <w:r>
+        <w:rPr>
+          <w:rtl/>
+        </w:rPr>
+        <w:t xml:space="preserve">تكتشف لوحة 🎭 المتحدثين كل تسمية متحدث في النص (المتحدث 1، المتحدث 2، سارة، الدكتور خان، إلخ) وتعرض قائمة منسدلة لصوت كل متحدث. افتراضياً، تُعيَّن أصوات مختلفة تلقائياً.</w:t>
+      </w:r>
+    </w:p>
+    <w:p>
+      <w:pPr>
+        <w:pStyle w:val="ListParagraph"/>
+        <w:numPr>
+          <w:ilvl w:val="0"/>
+          <w:numId w:val="4"/>
+        </w:numPr>
+        <w:bidi/>
+        <w:spacing w:after="40" w:before="40"/>
+        <w:jc w:val="right"/>
+      </w:pPr>
+      <w:r>
+        <w:rPr>
+          <w:rtl/>
+        </w:rPr>
+        <w:t xml:space="preserve">اختر صوتاً لكل متحدث — تعرض القائمة المنسدلة الأصوات الأكثر طبيعية أولاً.</w:t>
+      </w:r>
+    </w:p>
+    <w:p>
+      <w:pPr>
+        <w:pStyle w:val="ListParagraph"/>
+        <w:numPr>
+          <w:ilvl w:val="0"/>
+          <w:numId w:val="4"/>
+        </w:numPr>
+        <w:bidi/>
+        <w:spacing w:after="40" w:before="40"/>
+        <w:jc w:val="right"/>
+      </w:pPr>
+      <w:r>
+        <w:rPr>
+          <w:rtl/>
+        </w:rPr>
+        <w:t xml:space="preserve">اختر صوت السرد الافتراضي لأي فقرات غير معنونة.</w:t>
+      </w:r>
+    </w:p>
+    <w:p>
+      <w:pPr>
+        <w:pStyle w:val="ListParagraph"/>
+        <w:numPr>
+          <w:ilvl w:val="0"/>
+          <w:numId w:val="4"/>
+        </w:numPr>
+        <w:bidi/>
+        <w:spacing w:after="40" w:before="40"/>
+        <w:jc w:val="right"/>
+      </w:pPr>
+      <w:r>
+        <w:rPr>
+          <w:rtl/>
+        </w:rPr>
+        <w:t xml:space="preserve">انقر على 🔊 تجربة التشغيل للمعاينة. يقرأ المتصفح دور كل متحدث بصوته الخاص.</w:t>
+      </w:r>
+    </w:p>
+    <w:p>
+      <w:pPr>
+        <w:pStyle w:val="ListParagraph"/>
+        <w:numPr>
+          <w:ilvl w:val="0"/>
+          <w:numId w:val="4"/>
+        </w:numPr>
+        <w:bidi/>
+        <w:spacing w:after="40" w:before="40"/>
+        <w:jc w:val="right"/>
+      </w:pPr>
+      <w:r>
+        <w:rPr>
+          <w:rtl/>
+        </w:rPr>
+        <w:t xml:space="preserve">انقر على استخدم صوت الذكاء الاصطناعي (أو فقط انقر على حفظ) لحفظ النص وتعيينات الأصوات.</w:t>
       </w:r>
     </w:p>
     <w:p>
@@ -5124,7 +5103,34 @@
         <w:rPr>
           <w:rtl/>
         </w:rPr>
-        <w:t xml:space="preserve">لحظر لقطات الشاشة تماماً على macOS، يجب على الطلاب إجراء التقييم في تطبيق ClassCurio لسطح المكتب. لا يمكن للمتصفح حظر مفاتيح لقطة الشاشة لنظام macOS بالكامل.</w:t>
+        <w:t xml:space="preserve">على Mac، حمّل الأصوات المميزة (Premium) من إعدادات النظام ← إمكانية الوصول ← المحتوى المنطوق للحصول على صوت أكثر طبيعية. على Windows، تبدو أصوات Microsoft Natural في متصفح Edge بشرية تقريباً.</w:t>
+      </w:r>
+    </w:p>
+    <w:p>
+      <w:pPr>
+        <w:pStyle w:val="Heading3"/>
+      </w:pPr>
+      <w:r>
+        <w:rPr>
+          <w:b/>
+          <w:bCs/>
+          <w:color w:val="6D28D9"/>
+        </w:rPr>
+        <w:t xml:space="preserve">ما يراه الطالب</w:t>
+      </w:r>
+    </w:p>
+    <w:p>
+      <w:pPr>
+        <w:bidi/>
+        <w:spacing w:after="80" w:before="80"/>
+        <w:jc w:val="right"/>
+      </w:pPr>
+      <w:r>
+        <w:rPr>
+          <w:rFonts w:ascii="Arial" w:cs="Arial" w:eastAsia="Arial" w:hAnsi="Arial"/>
+          <w:rtl/>
+        </w:rPr>
+        <w:t xml:space="preserve">شريط أصفر لصوت الاستماع مثبت في أعلى عرض التقييم، مع زر واحد ▶ تشغيل. بعد انتهاء الصوت، يعرض الشريط عدد التشغيلات المتبقية. يقفل الزر عند الوصول إلى الحد الأقصى. لا يمكن إيقاف الصوت مؤقتاً أو إيقافه في منتصف التشغيل.</w:t>
       </w:r>
     </w:p>
     <w:p>
@@ -5145,79 +5151,21 @@
           <w:bCs/>
           <w:color w:val="1A1E33"/>
         </w:rPr>
-        <w:t xml:space="preserve">١١. مشاركة التقييم مع الطلاب</w:t>
-      </w:r>
-    </w:p>
-    <w:p>
-      <w:pPr>
-        <w:pStyle w:val="ListParagraph"/>
-        <w:numPr>
-          <w:ilvl w:val="0"/>
-          <w:numId w:val="4"/>
-        </w:numPr>
-        <w:bidi/>
-        <w:spacing w:after="40" w:before="40"/>
-        <w:jc w:val="right"/>
-      </w:pPr>
-      <w:r>
-        <w:rPr>
-          <w:rtl/>
-        </w:rPr>
-        <w:t xml:space="preserve">تأكد من ضبط التقييم على منشور في أداة الإنشاء.</w:t>
-      </w:r>
-    </w:p>
-    <w:p>
-      <w:pPr>
-        <w:pStyle w:val="ListParagraph"/>
-        <w:numPr>
-          <w:ilvl w:val="0"/>
-          <w:numId w:val="4"/>
-        </w:numPr>
-        <w:bidi/>
-        <w:spacing w:after="40" w:before="40"/>
-        <w:jc w:val="right"/>
-      </w:pPr>
-      <w:r>
-        <w:rPr>
-          <w:rtl/>
-        </w:rPr>
-        <w:t xml:space="preserve">في لوحة المعلومات، انقر على 🔗 مشاركة مع الطلاب على بطاقة التقييم.</w:t>
-      </w:r>
-    </w:p>
-    <w:p>
-      <w:pPr>
-        <w:pStyle w:val="ListParagraph"/>
-        <w:numPr>
-          <w:ilvl w:val="0"/>
-          <w:numId w:val="4"/>
-        </w:numPr>
-        <w:bidi/>
-        <w:spacing w:after="40" w:before="40"/>
-        <w:jc w:val="right"/>
-      </w:pPr>
-      <w:r>
-        <w:rPr>
-          <w:rtl/>
-        </w:rPr>
-        <w:t xml:space="preserve">تظهر لوحة بها رابط. انقر على نسخ، ثم الصق الرابط في دردشة فصلك (واتساب، البريد، Teams، إلخ).</w:t>
-      </w:r>
-    </w:p>
-    <w:p>
-      <w:pPr>
-        <w:pStyle w:val="ListParagraph"/>
-        <w:numPr>
-          <w:ilvl w:val="0"/>
-          <w:numId w:val="4"/>
-        </w:numPr>
-        <w:bidi/>
-        <w:spacing w:after="40" w:before="40"/>
-        <w:jc w:val="right"/>
-      </w:pPr>
-      <w:r>
-        <w:rPr>
-          <w:rtl/>
-        </w:rPr>
-        <w:t xml:space="preserve">ينقر الطلاب على الرابط، يسجلون الدخول (أو يسجلون إذا كانت المرة الأولى)، ويبدأون التقييم.</w:t>
+        <w:t xml:space="preserve">١١. قواعد القفل والمخالفات</w:t>
+      </w:r>
+    </w:p>
+    <w:p>
+      <w:pPr>
+        <w:bidi/>
+        <w:spacing w:after="80" w:before="80"/>
+        <w:jc w:val="right"/>
+      </w:pPr>
+      <w:r>
+        <w:rPr>
+          <w:rFonts w:ascii="Arial" w:cs="Arial" w:eastAsia="Arial" w:hAnsi="Arial"/>
+          <w:rtl/>
+        </w:rPr>
+        <w:t xml:space="preserve">كل تقييم محمي بطبقة قفل. لا يمكن للطلاب النسخ أو اللصق أو النقر بزر الفأرة الأيمن أو التقاط لقطات الشاشة (حيث يسمح نظام التشغيل للمتصفحات بحظرها) أو فتح نافذة أخرى أو الخروج من وضع ملء الشاشة.</w:t>
       </w:r>
     </w:p>
     <w:p>
@@ -5230,7 +5178,7 @@
           <w:bCs/>
           <w:color w:val="6D28D9"/>
         </w:rPr>
-        <w:t xml:space="preserve">المشاركة مع معلم آخر</w:t>
+        <w:t xml:space="preserve">قاعدة المخالفات الثلاث</w:t>
       </w:r>
     </w:p>
     <w:p>
@@ -5244,118 +5192,115 @@
           <w:rFonts w:ascii="Arial" w:cs="Arial" w:eastAsia="Arial" w:hAnsi="Arial"/>
           <w:rtl/>
         </w:rPr>
-        <w:t xml:space="preserve">انقر على 🤝 مشاركة مع معلم لإنشاء رابط معاينة للمعلمين فقط. يمكن للمعلم المستلم المعاينة أو الطباعة أو النسخ إلى فصله بنقرة واحدة.</w:t>
-      </w:r>
-    </w:p>
-    <w:p>
-      <w:pPr>
-        <w:spacing w:after="100" w:before="100"/>
-      </w:pPr>
-      <w:r>
-        <w:t xml:space="preserve"/>
-      </w:r>
-    </w:p>
-    <w:p>
-      <w:pPr>
-        <w:pStyle w:val="Heading1"/>
-      </w:pPr>
-      <w:r>
-        <w:rPr>
-          <w:b/>
-          <w:bCs/>
-          <w:color w:val="1A1E33"/>
-        </w:rPr>
-        <w:t xml:space="preserve">١٢. عرض النتائج والتحليلات</w:t>
-      </w:r>
-    </w:p>
-    <w:p>
-      <w:pPr>
-        <w:pStyle w:val="ListParagraph"/>
-        <w:numPr>
-          <w:ilvl w:val="0"/>
-          <w:numId w:val="4"/>
-        </w:numPr>
-        <w:bidi/>
-        <w:spacing w:after="40" w:before="40"/>
-        <w:jc w:val="right"/>
-      </w:pPr>
-      <w:r>
-        <w:rPr>
-          <w:rtl/>
-        </w:rPr>
-        <w:t xml:space="preserve">انقر على النتائج على بطاقة التقييم.</w:t>
-      </w:r>
-    </w:p>
-    <w:p>
-      <w:pPr>
-        <w:pStyle w:val="ListParagraph"/>
-        <w:numPr>
-          <w:ilvl w:val="0"/>
-          <w:numId w:val="4"/>
-        </w:numPr>
-        <w:bidi/>
-        <w:spacing w:after="40" w:before="40"/>
-        <w:jc w:val="right"/>
-      </w:pPr>
-      <w:r>
-        <w:rPr>
-          <w:rtl/>
-        </w:rPr>
-        <w:t xml:space="preserve">تعرض لوحة تحليلات الفصل في الأعلى توزيع الدرجات حسب النطاق (منخفض / متوسط / مرتفع، أو A1-C2 للمواد المشابهة للإنجليزية، أو PISA مستوى 1-6 للرياضيات/العلوم).</w:t>
-      </w:r>
-    </w:p>
-    <w:p>
-      <w:pPr>
-        <w:pStyle w:val="ListParagraph"/>
-        <w:numPr>
-          <w:ilvl w:val="0"/>
-          <w:numId w:val="4"/>
-        </w:numPr>
-        <w:bidi/>
-        <w:spacing w:after="40" w:before="40"/>
-        <w:jc w:val="right"/>
-      </w:pPr>
-      <w:r>
-        <w:rPr>
-          <w:rtl/>
-        </w:rPr>
-        <w:t xml:space="preserve">تحتها، يظهر كل طالب كصف مع درجته وزر بطاقة التقرير.</w:t>
-      </w:r>
-    </w:p>
-    <w:p>
-      <w:pPr>
-        <w:pStyle w:val="ListParagraph"/>
-        <w:numPr>
-          <w:ilvl w:val="0"/>
-          <w:numId w:val="4"/>
-        </w:numPr>
-        <w:bidi/>
-        <w:spacing w:after="40" w:before="40"/>
-        <w:jc w:val="right"/>
-      </w:pPr>
-      <w:r>
-        <w:rPr>
-          <w:rtl/>
-        </w:rPr>
-        <w:t xml:space="preserve">انقر على بطاقة التقرير لطالب واحد لرؤية كل سؤال وإجابته والإجابة الصحيحة وتعليق Claude على المقالات.</w:t>
-      </w:r>
-    </w:p>
-    <w:p>
-      <w:pPr>
-        <w:pStyle w:val="ListParagraph"/>
-        <w:numPr>
-          <w:ilvl w:val="0"/>
-          <w:numId w:val="4"/>
-        </w:numPr>
-        <w:bidi/>
-        <w:spacing w:after="40" w:before="40"/>
-        <w:jc w:val="right"/>
-      </w:pPr>
-      <w:r>
-        <w:rPr>
-          <w:rtl/>
-        </w:rPr>
-        <w:t xml:space="preserve">إذا تم تصحيح مقال طالب آلياً ولكنك لا توافق، فانقر على تجاوز التصحيح وأدخل علامتك الخاصة.</w:t>
+        <w:t xml:space="preserve">كل مخالفة تعتبر إنذاراً واحداً. عند الإنذار الثالث، يُسلَّم التقييم تلقائياً ويُخرج الطالب. أمثلة على المخالفات:</w:t>
+      </w:r>
+    </w:p>
+    <w:p>
+      <w:pPr>
+        <w:pStyle w:val="ListParagraph"/>
+        <w:numPr>
+          <w:ilvl w:val="0"/>
+          <w:numId w:val="5"/>
+        </w:numPr>
+        <w:bidi/>
+        <w:spacing w:after="40" w:before="40"/>
+        <w:jc w:val="right"/>
+      </w:pPr>
+      <w:r>
+        <w:rPr>
+          <w:rtl/>
+        </w:rPr>
+        <w:t xml:space="preserve">تبديل علامة التبويب / Cmd+Tab / تصغير — إنذار واحد.</w:t>
+      </w:r>
+    </w:p>
+    <w:p>
+      <w:pPr>
+        <w:pStyle w:val="ListParagraph"/>
+        <w:numPr>
+          <w:ilvl w:val="0"/>
+          <w:numId w:val="5"/>
+        </w:numPr>
+        <w:bidi/>
+        <w:spacing w:after="40" w:before="40"/>
+        <w:jc w:val="right"/>
+      </w:pPr>
+      <w:r>
+        <w:rPr>
+          <w:rtl/>
+        </w:rPr>
+        <w:t xml:space="preserve">فقدان النافذة للتركيز — إنذار واحد.</w:t>
+      </w:r>
+    </w:p>
+    <w:p>
+      <w:pPr>
+        <w:pStyle w:val="ListParagraph"/>
+        <w:numPr>
+          <w:ilvl w:val="0"/>
+          <w:numId w:val="5"/>
+        </w:numPr>
+        <w:bidi/>
+        <w:spacing w:after="40" w:before="40"/>
+        <w:jc w:val="right"/>
+      </w:pPr>
+      <w:r>
+        <w:rPr>
+          <w:rtl/>
+        </w:rPr>
+        <w:t xml:space="preserve">الخروج من وضع ملء الشاشة — إنذار واحد.</w:t>
+      </w:r>
+    </w:p>
+    <w:p>
+      <w:pPr>
+        <w:pStyle w:val="ListParagraph"/>
+        <w:numPr>
+          <w:ilvl w:val="0"/>
+          <w:numId w:val="5"/>
+        </w:numPr>
+        <w:bidi/>
+        <w:spacing w:after="40" w:before="40"/>
+        <w:jc w:val="right"/>
+      </w:pPr>
+      <w:r>
+        <w:rPr>
+          <w:rtl/>
+        </w:rPr>
+        <w:t xml:space="preserve">الضغط على اختصار لقطة الشاشة (PrintScreen، Cmd+Shift+S، إلخ) — إنذار واحد.</w:t>
+      </w:r>
+    </w:p>
+    <w:p>
+      <w:pPr>
+        <w:pStyle w:val="ListParagraph"/>
+        <w:numPr>
+          <w:ilvl w:val="0"/>
+          <w:numId w:val="5"/>
+        </w:numPr>
+        <w:bidi/>
+        <w:spacing w:after="40" w:before="40"/>
+        <w:jc w:val="right"/>
+      </w:pPr>
+      <w:r>
+        <w:rPr>
+          <w:rtl/>
+        </w:rPr>
+        <w:t xml:space="preserve">إيقاف الكاميرا / تغطيتها / كتم صوتها — إنذار واحد (وضع عبر الإنترنت فقط).</w:t>
+      </w:r>
+    </w:p>
+    <w:p>
+      <w:pPr>
+        <w:pStyle w:val="ListParagraph"/>
+        <w:numPr>
+          <w:ilvl w:val="0"/>
+          <w:numId w:val="5"/>
+        </w:numPr>
+        <w:bidi/>
+        <w:spacing w:after="40" w:before="40"/>
+        <w:jc w:val="right"/>
+      </w:pPr>
+      <w:r>
+        <w:rPr>
+          <w:rtl/>
+        </w:rPr>
+        <w:t xml:space="preserve">وجه مختلف / لا وجه مرئي — إنذار واحد (وضع عبر الإنترنت فقط).</w:t>
       </w:r>
     </w:p>
     <w:p>
@@ -5368,82 +5313,7 @@
           <w:bCs/>
           <w:color w:val="6D28D9"/>
         </w:rPr>
-        <w:t xml:space="preserve">التصدير</w:t>
-      </w:r>
-    </w:p>
-    <w:p>
-      <w:pPr>
-        <w:pStyle w:val="ListParagraph"/>
-        <w:numPr>
-          <w:ilvl w:val="0"/>
-          <w:numId w:val="5"/>
-        </w:numPr>
-        <w:bidi/>
-        <w:spacing w:after="40" w:before="40"/>
-        <w:jc w:val="right"/>
-      </w:pPr>
-      <w:r>
-        <w:rPr>
-          <w:rtl/>
-        </w:rPr>
-        <w:t xml:space="preserve">انقر على 📊 ورقة الدرجات Excel لتنزيل جميع النتائج كجدول بيانات.</w:t>
-      </w:r>
-    </w:p>
-    <w:p>
-      <w:pPr>
-        <w:pStyle w:val="ListParagraph"/>
-        <w:numPr>
-          <w:ilvl w:val="0"/>
-          <w:numId w:val="5"/>
-        </w:numPr>
-        <w:bidi/>
-        <w:spacing w:after="40" w:before="40"/>
-        <w:jc w:val="right"/>
-      </w:pPr>
-      <w:r>
-        <w:rPr>
-          <w:rtl/>
-        </w:rPr>
-        <w:t xml:space="preserve">انقر على 📄 PDF لتنزيل التقييم الفارغ كملف PDF قابل للطباعة.</w:t>
-      </w:r>
-    </w:p>
-    <w:p>
-      <w:pPr>
-        <w:pStyle w:val="ListParagraph"/>
-        <w:numPr>
-          <w:ilvl w:val="0"/>
-          <w:numId w:val="5"/>
-        </w:numPr>
-        <w:bidi/>
-        <w:spacing w:after="40" w:before="40"/>
-        <w:jc w:val="right"/>
-      </w:pPr>
-      <w:r>
-        <w:rPr>
-          <w:rtl/>
-        </w:rPr>
-        <w:t xml:space="preserve">انقر على Word doc لتنزيل التقييم بصيغة .docx قابلة للتعديل.</w:t>
-      </w:r>
-    </w:p>
-    <w:p>
-      <w:pPr>
-        <w:spacing w:after="100" w:before="100"/>
-      </w:pPr>
-      <w:r>
-        <w:t xml:space="preserve"/>
-      </w:r>
-    </w:p>
-    <w:p>
-      <w:pPr>
-        <w:pStyle w:val="Heading1"/>
-      </w:pPr>
-      <w:r>
-        <w:rPr>
-          <w:b/>
-          <w:bCs/>
-          <w:color w:val="1A1E33"/>
-        </w:rPr>
-        <w:t xml:space="preserve">١٣. عندما يتم إخراج الطالب</w:t>
+        <w:t xml:space="preserve">مراقبة الكاميرا (وضع عبر الإنترنت فقط)</w:t>
       </w:r>
     </w:p>
     <w:p>
@@ -5457,114 +5327,7 @@
           <w:rFonts w:ascii="Arial" w:cs="Arial" w:eastAsia="Arial" w:hAnsi="Arial"/>
           <w:rtl/>
         </w:rPr>
-        <w:t xml:space="preserve">إذا انتهك الطالب قاعدة المخالفات الثلاث أو فقد الاتصال، يمكنك منح إعادة دخول لمرة واحدة حتى يكمل التقييم.</w:t>
-      </w:r>
-    </w:p>
-    <w:p>
-      <w:pPr>
-        <w:pStyle w:val="ListParagraph"/>
-        <w:numPr>
-          <w:ilvl w:val="0"/>
-          <w:numId w:val="4"/>
-        </w:numPr>
-        <w:bidi/>
-        <w:spacing w:after="40" w:before="40"/>
-        <w:jc w:val="right"/>
-      </w:pPr>
-      <w:r>
-        <w:rPr>
-          <w:rtl/>
-        </w:rPr>
-        <w:t xml:space="preserve">افتح النتائج للتقييم.</w:t>
-      </w:r>
-    </w:p>
-    <w:p>
-      <w:pPr>
-        <w:pStyle w:val="ListParagraph"/>
-        <w:numPr>
-          <w:ilvl w:val="0"/>
-          <w:numId w:val="4"/>
-        </w:numPr>
-        <w:bidi/>
-        <w:spacing w:after="40" w:before="40"/>
-        <w:jc w:val="right"/>
-      </w:pPr>
-      <w:r>
-        <w:rPr>
-          <w:rtl/>
-        </w:rPr>
-        <w:t xml:space="preserve">ابحث عن الطالب في القائمة. إذا ظهر بشارة "تم إخراجه"، فانقر على منح إعادة الدخول بجوار اسمه.</w:t>
-      </w:r>
-    </w:p>
-    <w:p>
-      <w:pPr>
-        <w:pStyle w:val="ListParagraph"/>
-        <w:numPr>
-          <w:ilvl w:val="0"/>
-          <w:numId w:val="4"/>
-        </w:numPr>
-        <w:bidi/>
-        <w:spacing w:after="40" w:before="40"/>
-        <w:jc w:val="right"/>
-      </w:pPr>
-      <w:r>
-        <w:rPr>
-          <w:rtl/>
-        </w:rPr>
-        <w:t xml:space="preserve">إذا لم يظهر الطالب (لأنه تم إخراجه قبل تقديم أي شيء)، فاستخدم لوحة منح إعادة الدخول بالبريد الإلكتروني في أسفل صفحة النتائج. أدخل بريده الإلكتروني وانقر على منح.</w:t>
-      </w:r>
-    </w:p>
-    <w:p>
-      <w:pPr>
-        <w:pStyle w:val="ListParagraph"/>
-        <w:numPr>
-          <w:ilvl w:val="0"/>
-          <w:numId w:val="4"/>
-        </w:numPr>
-        <w:bidi/>
-        <w:spacing w:after="40" w:before="40"/>
-        <w:jc w:val="right"/>
-      </w:pPr>
-      <w:r>
-        <w:rPr>
-          <w:rtl/>
-        </w:rPr>
-        <w:t xml:space="preserve">أخبر الطالب بإعادة تسجيل الدخول وإعادة فتح التقييم. سيستأنف من حيث توقف، مع تعبئة إجاباته السابقة مسبقاً.</w:t>
-      </w:r>
-    </w:p>
-    <w:p>
-      <w:pPr>
-        <w:spacing w:after="100" w:before="100"/>
-      </w:pPr>
-      <w:r>
-        <w:t xml:space="preserve"/>
-      </w:r>
-    </w:p>
-    <w:p>
-      <w:pPr>
-        <w:pStyle w:val="Heading1"/>
-      </w:pPr>
-      <w:r>
-        <w:rPr>
-          <w:b/>
-          <w:bCs/>
-          <w:color w:val="1A1E33"/>
-        </w:rPr>
-        <w:t xml:space="preserve">١٤. الإعدادات ومفتاح الذكاء الاصطناعي</w:t>
-      </w:r>
-    </w:p>
-    <w:p>
-      <w:pPr>
-        <w:bidi/>
-        <w:spacing w:after="80" w:before="80"/>
-        <w:jc w:val="right"/>
-      </w:pPr>
-      <w:r>
-        <w:rPr>
-          <w:rFonts w:ascii="Arial" w:cs="Arial" w:eastAsia="Arial" w:hAnsi="Arial"/>
-          <w:rtl/>
-        </w:rPr>
-        <w:t xml:space="preserve">ميزات الذكاء الاصطناعي (إنشاء التقييم، إنشاء النص، تصحيح المقال الآلي، فحوصات الهوية، رؤية الكاميرا) تحتاج جميعها إلى مفتاح Anthropic API. أضف واحداً في الإعدادات ← مفتاح API. يتم تخزين المفتاح على الخادم فقط، ولا يتم مشاركته مع الطلاب، وينطبق على كل تقييم في مدرستك.</w:t>
+        <w:t xml:space="preserve">تتطلب التقييمات عبر الإنترنت من الطالب منح الإذن للوصول إلى الكاميرا في البداية. يتم التحقق من الهوية كل 15 ثانية تقريباً. يتم الإبلاغ عن التحدث، ووجود أكثر من شخص في الإطار، وتوجيه الهواتف نحو الشاشة.</w:t>
       </w:r>
     </w:p>
     <w:p>
@@ -5589,6 +5352,471 @@
         <w:rPr>
           <w:rtl/>
         </w:rPr>
+        <w:t xml:space="preserve">لحظر لقطات الشاشة تماماً على macOS، يجب على الطلاب إجراء التقييم في تطبيق ClassCurio لسطح المكتب. لا يمكن للمتصفح حظر مفاتيح لقطة الشاشة لنظام macOS بالكامل.</w:t>
+      </w:r>
+    </w:p>
+    <w:p>
+      <w:pPr>
+        <w:spacing w:after="100" w:before="100"/>
+      </w:pPr>
+      <w:r>
+        <w:t xml:space="preserve"/>
+      </w:r>
+    </w:p>
+    <w:p>
+      <w:pPr>
+        <w:pStyle w:val="Heading1"/>
+      </w:pPr>
+      <w:r>
+        <w:rPr>
+          <w:b/>
+          <w:bCs/>
+          <w:color w:val="1A1E33"/>
+        </w:rPr>
+        <w:t xml:space="preserve">١٢. مشاركة التقييم مع الطلاب</w:t>
+      </w:r>
+    </w:p>
+    <w:p>
+      <w:pPr>
+        <w:pStyle w:val="ListParagraph"/>
+        <w:numPr>
+          <w:ilvl w:val="0"/>
+          <w:numId w:val="4"/>
+        </w:numPr>
+        <w:bidi/>
+        <w:spacing w:after="40" w:before="40"/>
+        <w:jc w:val="right"/>
+      </w:pPr>
+      <w:r>
+        <w:rPr>
+          <w:rtl/>
+        </w:rPr>
+        <w:t xml:space="preserve">تأكد من ضبط التقييم على منشور في أداة الإنشاء.</w:t>
+      </w:r>
+    </w:p>
+    <w:p>
+      <w:pPr>
+        <w:pStyle w:val="ListParagraph"/>
+        <w:numPr>
+          <w:ilvl w:val="0"/>
+          <w:numId w:val="4"/>
+        </w:numPr>
+        <w:bidi/>
+        <w:spacing w:after="40" w:before="40"/>
+        <w:jc w:val="right"/>
+      </w:pPr>
+      <w:r>
+        <w:rPr>
+          <w:rtl/>
+        </w:rPr>
+        <w:t xml:space="preserve">في لوحة المعلومات، انقر على 🔗 مشاركة مع الطلاب على بطاقة التقييم.</w:t>
+      </w:r>
+    </w:p>
+    <w:p>
+      <w:pPr>
+        <w:pStyle w:val="ListParagraph"/>
+        <w:numPr>
+          <w:ilvl w:val="0"/>
+          <w:numId w:val="4"/>
+        </w:numPr>
+        <w:bidi/>
+        <w:spacing w:after="40" w:before="40"/>
+        <w:jc w:val="right"/>
+      </w:pPr>
+      <w:r>
+        <w:rPr>
+          <w:rtl/>
+        </w:rPr>
+        <w:t xml:space="preserve">تظهر لوحة بها رابط. انقر على نسخ، ثم الصق الرابط في دردشة فصلك (واتساب، البريد، Teams، إلخ).</w:t>
+      </w:r>
+    </w:p>
+    <w:p>
+      <w:pPr>
+        <w:pStyle w:val="ListParagraph"/>
+        <w:numPr>
+          <w:ilvl w:val="0"/>
+          <w:numId w:val="4"/>
+        </w:numPr>
+        <w:bidi/>
+        <w:spacing w:after="40" w:before="40"/>
+        <w:jc w:val="right"/>
+      </w:pPr>
+      <w:r>
+        <w:rPr>
+          <w:rtl/>
+        </w:rPr>
+        <w:t xml:space="preserve">ينقر الطلاب على الرابط، يسجلون الدخول (أو يسجلون إذا كانت المرة الأولى)، ويبدأون التقييم.</w:t>
+      </w:r>
+    </w:p>
+    <w:p>
+      <w:pPr>
+        <w:pStyle w:val="Heading3"/>
+      </w:pPr>
+      <w:r>
+        <w:rPr>
+          <w:b/>
+          <w:bCs/>
+          <w:color w:val="6D28D9"/>
+        </w:rPr>
+        <w:t xml:space="preserve">المشاركة مع معلم آخر</w:t>
+      </w:r>
+    </w:p>
+    <w:p>
+      <w:pPr>
+        <w:bidi/>
+        <w:spacing w:after="80" w:before="80"/>
+        <w:jc w:val="right"/>
+      </w:pPr>
+      <w:r>
+        <w:rPr>
+          <w:rFonts w:ascii="Arial" w:cs="Arial" w:eastAsia="Arial" w:hAnsi="Arial"/>
+          <w:rtl/>
+        </w:rPr>
+        <w:t xml:space="preserve">انقر على 🤝 مشاركة مع معلم لإنشاء رابط معاينة للمعلمين فقط. يمكن للمعلم المستلم المعاينة أو الطباعة أو النسخ إلى فصله بنقرة واحدة.</w:t>
+      </w:r>
+    </w:p>
+    <w:p>
+      <w:pPr>
+        <w:spacing w:after="100" w:before="100"/>
+      </w:pPr>
+      <w:r>
+        <w:t xml:space="preserve"/>
+      </w:r>
+    </w:p>
+    <w:p>
+      <w:pPr>
+        <w:pStyle w:val="Heading1"/>
+      </w:pPr>
+      <w:r>
+        <w:rPr>
+          <w:b/>
+          <w:bCs/>
+          <w:color w:val="1A1E33"/>
+        </w:rPr>
+        <w:t xml:space="preserve">١٣. عرض النتائج والتحليلات</w:t>
+      </w:r>
+    </w:p>
+    <w:p>
+      <w:pPr>
+        <w:pStyle w:val="ListParagraph"/>
+        <w:numPr>
+          <w:ilvl w:val="0"/>
+          <w:numId w:val="4"/>
+        </w:numPr>
+        <w:bidi/>
+        <w:spacing w:after="40" w:before="40"/>
+        <w:jc w:val="right"/>
+      </w:pPr>
+      <w:r>
+        <w:rPr>
+          <w:rtl/>
+        </w:rPr>
+        <w:t xml:space="preserve">انقر على النتائج على بطاقة التقييم.</w:t>
+      </w:r>
+    </w:p>
+    <w:p>
+      <w:pPr>
+        <w:pStyle w:val="ListParagraph"/>
+        <w:numPr>
+          <w:ilvl w:val="0"/>
+          <w:numId w:val="4"/>
+        </w:numPr>
+        <w:bidi/>
+        <w:spacing w:after="40" w:before="40"/>
+        <w:jc w:val="right"/>
+      </w:pPr>
+      <w:r>
+        <w:rPr>
+          <w:rtl/>
+        </w:rPr>
+        <w:t xml:space="preserve">تعرض لوحة تحليلات الفصل في الأعلى توزيع الدرجات حسب النطاق (منخفض / متوسط / مرتفع، أو A1-C2 للمواد المشابهة للإنجليزية، أو PISA مستوى 1-6 للرياضيات/العلوم).</w:t>
+      </w:r>
+    </w:p>
+    <w:p>
+      <w:pPr>
+        <w:pStyle w:val="ListParagraph"/>
+        <w:numPr>
+          <w:ilvl w:val="0"/>
+          <w:numId w:val="4"/>
+        </w:numPr>
+        <w:bidi/>
+        <w:spacing w:after="40" w:before="40"/>
+        <w:jc w:val="right"/>
+      </w:pPr>
+      <w:r>
+        <w:rPr>
+          <w:rtl/>
+        </w:rPr>
+        <w:t xml:space="preserve">تحتها، يظهر كل طالب كصف مع درجته وزر بطاقة التقرير.</w:t>
+      </w:r>
+    </w:p>
+    <w:p>
+      <w:pPr>
+        <w:pStyle w:val="ListParagraph"/>
+        <w:numPr>
+          <w:ilvl w:val="0"/>
+          <w:numId w:val="4"/>
+        </w:numPr>
+        <w:bidi/>
+        <w:spacing w:after="40" w:before="40"/>
+        <w:jc w:val="right"/>
+      </w:pPr>
+      <w:r>
+        <w:rPr>
+          <w:rtl/>
+        </w:rPr>
+        <w:t xml:space="preserve">انقر على بطاقة التقرير لطالب واحد لرؤية كل سؤال وإجابته والإجابة الصحيحة وتعليق Claude على المقالات.</w:t>
+      </w:r>
+    </w:p>
+    <w:p>
+      <w:pPr>
+        <w:pStyle w:val="ListParagraph"/>
+        <w:numPr>
+          <w:ilvl w:val="0"/>
+          <w:numId w:val="4"/>
+        </w:numPr>
+        <w:bidi/>
+        <w:spacing w:after="40" w:before="40"/>
+        <w:jc w:val="right"/>
+      </w:pPr>
+      <w:r>
+        <w:rPr>
+          <w:rtl/>
+        </w:rPr>
+        <w:t xml:space="preserve">إذا تم تصحيح مقال طالب آلياً ولكنك لا توافق، فانقر على تجاوز التصحيح وأدخل علامتك الخاصة.</w:t>
+      </w:r>
+    </w:p>
+    <w:p>
+      <w:pPr>
+        <w:pStyle w:val="Heading3"/>
+      </w:pPr>
+      <w:r>
+        <w:rPr>
+          <w:b/>
+          <w:bCs/>
+          <w:color w:val="6D28D9"/>
+        </w:rPr>
+        <w:t xml:space="preserve">التصدير</w:t>
+      </w:r>
+    </w:p>
+    <w:p>
+      <w:pPr>
+        <w:pStyle w:val="ListParagraph"/>
+        <w:numPr>
+          <w:ilvl w:val="0"/>
+          <w:numId w:val="5"/>
+        </w:numPr>
+        <w:bidi/>
+        <w:spacing w:after="40" w:before="40"/>
+        <w:jc w:val="right"/>
+      </w:pPr>
+      <w:r>
+        <w:rPr>
+          <w:rtl/>
+        </w:rPr>
+        <w:t xml:space="preserve">انقر على 📊 ورقة الدرجات Excel لتنزيل جميع النتائج كجدول بيانات.</w:t>
+      </w:r>
+    </w:p>
+    <w:p>
+      <w:pPr>
+        <w:pStyle w:val="ListParagraph"/>
+        <w:numPr>
+          <w:ilvl w:val="0"/>
+          <w:numId w:val="5"/>
+        </w:numPr>
+        <w:bidi/>
+        <w:spacing w:after="40" w:before="40"/>
+        <w:jc w:val="right"/>
+      </w:pPr>
+      <w:r>
+        <w:rPr>
+          <w:rtl/>
+        </w:rPr>
+        <w:t xml:space="preserve">انقر على 📄 PDF لتنزيل التقييم الفارغ كملف PDF قابل للطباعة.</w:t>
+      </w:r>
+    </w:p>
+    <w:p>
+      <w:pPr>
+        <w:pStyle w:val="ListParagraph"/>
+        <w:numPr>
+          <w:ilvl w:val="0"/>
+          <w:numId w:val="5"/>
+        </w:numPr>
+        <w:bidi/>
+        <w:spacing w:after="40" w:before="40"/>
+        <w:jc w:val="right"/>
+      </w:pPr>
+      <w:r>
+        <w:rPr>
+          <w:rtl/>
+        </w:rPr>
+        <w:t xml:space="preserve">انقر على Word doc لتنزيل التقييم بصيغة .docx قابلة للتعديل.</w:t>
+      </w:r>
+    </w:p>
+    <w:p>
+      <w:pPr>
+        <w:spacing w:after="100" w:before="100"/>
+      </w:pPr>
+      <w:r>
+        <w:t xml:space="preserve"/>
+      </w:r>
+    </w:p>
+    <w:p>
+      <w:pPr>
+        <w:pStyle w:val="Heading1"/>
+      </w:pPr>
+      <w:r>
+        <w:rPr>
+          <w:b/>
+          <w:bCs/>
+          <w:color w:val="1A1E33"/>
+        </w:rPr>
+        <w:t xml:space="preserve">١٤. عندما يتم إخراج الطالب</w:t>
+      </w:r>
+    </w:p>
+    <w:p>
+      <w:pPr>
+        <w:bidi/>
+        <w:spacing w:after="80" w:before="80"/>
+        <w:jc w:val="right"/>
+      </w:pPr>
+      <w:r>
+        <w:rPr>
+          <w:rFonts w:ascii="Arial" w:cs="Arial" w:eastAsia="Arial" w:hAnsi="Arial"/>
+          <w:rtl/>
+        </w:rPr>
+        <w:t xml:space="preserve">إذا انتهك الطالب قاعدة المخالفات الثلاث أو فقد الاتصال، يمكنك منح إعادة دخول لمرة واحدة حتى يكمل التقييم.</w:t>
+      </w:r>
+    </w:p>
+    <w:p>
+      <w:pPr>
+        <w:pStyle w:val="ListParagraph"/>
+        <w:numPr>
+          <w:ilvl w:val="0"/>
+          <w:numId w:val="4"/>
+        </w:numPr>
+        <w:bidi/>
+        <w:spacing w:after="40" w:before="40"/>
+        <w:jc w:val="right"/>
+      </w:pPr>
+      <w:r>
+        <w:rPr>
+          <w:rtl/>
+        </w:rPr>
+        <w:t xml:space="preserve">افتح النتائج للتقييم.</w:t>
+      </w:r>
+    </w:p>
+    <w:p>
+      <w:pPr>
+        <w:pStyle w:val="ListParagraph"/>
+        <w:numPr>
+          <w:ilvl w:val="0"/>
+          <w:numId w:val="4"/>
+        </w:numPr>
+        <w:bidi/>
+        <w:spacing w:after="40" w:before="40"/>
+        <w:jc w:val="right"/>
+      </w:pPr>
+      <w:r>
+        <w:rPr>
+          <w:rtl/>
+        </w:rPr>
+        <w:t xml:space="preserve">ابحث عن الطالب في القائمة. إذا ظهر بشارة "تم إخراجه"، فانقر على منح إعادة الدخول بجوار اسمه.</w:t>
+      </w:r>
+    </w:p>
+    <w:p>
+      <w:pPr>
+        <w:pStyle w:val="ListParagraph"/>
+        <w:numPr>
+          <w:ilvl w:val="0"/>
+          <w:numId w:val="4"/>
+        </w:numPr>
+        <w:bidi/>
+        <w:spacing w:after="40" w:before="40"/>
+        <w:jc w:val="right"/>
+      </w:pPr>
+      <w:r>
+        <w:rPr>
+          <w:rtl/>
+        </w:rPr>
+        <w:t xml:space="preserve">إذا لم يظهر الطالب (لأنه تم إخراجه قبل تقديم أي شيء)، فاستخدم لوحة منح إعادة الدخول بالبريد الإلكتروني في أسفل صفحة النتائج. أدخل بريده الإلكتروني وانقر على منح.</w:t>
+      </w:r>
+    </w:p>
+    <w:p>
+      <w:pPr>
+        <w:pStyle w:val="ListParagraph"/>
+        <w:numPr>
+          <w:ilvl w:val="0"/>
+          <w:numId w:val="4"/>
+        </w:numPr>
+        <w:bidi/>
+        <w:spacing w:after="40" w:before="40"/>
+        <w:jc w:val="right"/>
+      </w:pPr>
+      <w:r>
+        <w:rPr>
+          <w:rtl/>
+        </w:rPr>
+        <w:t xml:space="preserve">أخبر الطالب بإعادة تسجيل الدخول وإعادة فتح التقييم. سيستأنف من حيث توقف، مع تعبئة إجاباته السابقة مسبقاً.</w:t>
+      </w:r>
+    </w:p>
+    <w:p>
+      <w:pPr>
+        <w:spacing w:after="100" w:before="100"/>
+      </w:pPr>
+      <w:r>
+        <w:t xml:space="preserve"/>
+      </w:r>
+    </w:p>
+    <w:p>
+      <w:pPr>
+        <w:pStyle w:val="Heading1"/>
+      </w:pPr>
+      <w:r>
+        <w:rPr>
+          <w:b/>
+          <w:bCs/>
+          <w:color w:val="1A1E33"/>
+        </w:rPr>
+        <w:t xml:space="preserve">١٥. الإعدادات ومفتاح الذكاء الاصطناعي</w:t>
+      </w:r>
+    </w:p>
+    <w:p>
+      <w:pPr>
+        <w:bidi/>
+        <w:spacing w:after="80" w:before="80"/>
+        <w:jc w:val="right"/>
+      </w:pPr>
+      <w:r>
+        <w:rPr>
+          <w:rFonts w:ascii="Arial" w:cs="Arial" w:eastAsia="Arial" w:hAnsi="Arial"/>
+          <w:rtl/>
+        </w:rPr>
+        <w:t xml:space="preserve">ميزات الذكاء الاصطناعي (إنشاء التقييم، إنشاء النص، تصحيح المقال الآلي، فحوصات الهوية، رؤية الكاميرا) تحتاج جميعها إلى مفتاح Anthropic API. أضف واحداً في الإعدادات ← مفتاح API. يتم تخزين المفتاح على الخادم فقط، ولا يتم مشاركته مع الطلاب، وينطبق على كل تقييم في مدرستك.</w:t>
+      </w:r>
+    </w:p>
+    <w:p>
+      <w:pPr>
+        <w:pBdr>
+          <w:left w:val="single" w:color="F59E0B" w:sz="18"/>
+        </w:pBdr>
+        <w:shd w:fill="FEF7E6" w:val="clear"/>
+        <w:bidi/>
+        <w:spacing w:after="100" w:before="100"/>
+        <w:jc w:val="right"/>
+      </w:pPr>
+      <w:r>
+        <w:rPr>
+          <w:b/>
+          <w:bCs/>
+          <w:rtl/>
+        </w:rPr>
+        <w:t xml:space="preserve">💡 نصيحة: </w:t>
+      </w:r>
+      <w:r>
+        <w:rPr>
+          <w:rtl/>
+        </w:rPr>
         <w:t xml:space="preserve">إذا قال إنشاء الذكاء الاصطناعي "لم يتم تكوين مفتاح Anthropic API،" فهذا هو المكان الذي تصلحه فيه.</w:t>
       </w:r>
     </w:p>
@@ -5610,7 +5838,7 @@
           <w:bCs/>
           <w:color w:val="1A1E33"/>
         </w:rPr>
-        <w:t xml:space="preserve">١٥. نصائح للنشر للمرة الأولى</w:t>
+        <w:t xml:space="preserve">١٦. نصائح للنشر للمرة الأولى</w:t>
       </w:r>
     </w:p>
     <w:p>

</xml_diff>